<commit_message>
Phase 1 final build for all 254 counties: counties.csv, summary.docx, full_analysis.docx; rule 47 audit; pilot report addendum
Co-Authored-By: Claude Opus 5.5 <noreply@anthropic.com>
Claude-Session: https://claude.ai/code/session_01SDNZBG6oNndbYxCTBGxc63
</commit_message>
<xml_diff>
--- a/full_analysis.docx
+++ b/full_analysis.docx
@@ -13,7 +13,7 @@
     </w:p>
     <w:p>
       <w:r>
-        <w:t>Phase 1 results, method, verification, and per-county detail for all 254 counties. Generated 2026-10-02 16:05 UTC.</w:t>
+        <w:t>Phase 1 results, method, verification, and per-county detail for all 254 counties. Generated 2026-10-02 17:00 UTC.</w:t>
       </w:r>
     </w:p>
     <w:p>
@@ -261,6 +261,20 @@
         <w:rPr>
           <w:b/>
         </w:rPr>
+        <w:t xml:space="preserve">Evidence rules for LATER and END. </w:t>
+      </w:r>
+      <w:r>
+        <w:t>LATER needs a county-totals file with a printed run time or upload time on election night and no election-day precinct numbers that night; if only files dated after election night survive, the election is UNDETERMINED. END or LIVE from county-posted reports needs the precinct report's upload time on election night, or no upload time at all and a printed run time on election night; a known later upload (for example a re-upload) cannot show election-night publication.</w:t>
+      </w:r>
+    </w:p>
+    <w:p>
+      <w:pPr>
+        <w:pStyle w:val="ListBullet"/>
+      </w:pPr>
+      <w:r>
+        <w:rPr>
+          <w:b/>
+        </w:rPr>
         <w:t xml:space="preserve">Tag. </w:t>
       </w:r>
       <w:r>
@@ -427,7 +441,7 @@
           </w:tcPr>
           <w:p>
             <w:r>
-              <w:t>20</w:t>
+              <w:t>21</w:t>
             </w:r>
           </w:p>
         </w:tc>
@@ -437,7 +451,7 @@
           </w:tcPr>
           <w:p>
             <w:r>
-              <w:t>17</w:t>
+              <w:t>18</w:t>
             </w:r>
           </w:p>
         </w:tc>
@@ -479,7 +493,7 @@
           </w:tcPr>
           <w:p>
             <w:r>
-              <w:t>19</w:t>
+              <w:t>21</w:t>
             </w:r>
           </w:p>
         </w:tc>
@@ -489,7 +503,7 @@
           </w:tcPr>
           <w:p>
             <w:r>
-              <w:t>4</w:t>
+              <w:t>2</w:t>
             </w:r>
           </w:p>
         </w:tc>
@@ -499,17 +513,17 @@
           </w:tcPr>
           <w:p>
             <w:r>
+              <w:t>9</w:t>
+            </w:r>
+          </w:p>
+        </w:tc>
+        <w:tc>
+          <w:tcPr>
+            <w:tcW w:type="dxa" w:w="1728"/>
+          </w:tcPr>
+          <w:p>
+            <w:r>
               <w:t>10</w:t>
-            </w:r>
-          </w:p>
-        </w:tc>
-        <w:tc>
-          <w:tcPr>
-            <w:tcW w:type="dxa" w:w="1728"/>
-          </w:tcPr>
-          <w:p>
-            <w:r>
-              <w:t>5</w:t>
             </w:r>
           </w:p>
         </w:tc>
@@ -531,7 +545,7 @@
           </w:tcPr>
           <w:p>
             <w:r>
-              <w:t>125</w:t>
+              <w:t>105</w:t>
             </w:r>
           </w:p>
         </w:tc>
@@ -551,7 +565,7 @@
           </w:tcPr>
           <w:p>
             <w:r>
-              <w:t>87</w:t>
+              <w:t>57</w:t>
             </w:r>
           </w:p>
         </w:tc>
@@ -561,7 +575,7 @@
           </w:tcPr>
           <w:p>
             <w:r>
-              <w:t>37</w:t>
+              <w:t>47</w:t>
             </w:r>
           </w:p>
         </w:tc>
@@ -583,7 +597,7 @@
           </w:tcPr>
           <w:p>
             <w:r>
-              <w:t>3</w:t>
+              <w:t>1</w:t>
             </w:r>
           </w:p>
         </w:tc>
@@ -603,17 +617,17 @@
           </w:tcPr>
           <w:p>
             <w:r>
+              <w:t>0</w:t>
+            </w:r>
+          </w:p>
+        </w:tc>
+        <w:tc>
+          <w:tcPr>
+            <w:tcW w:type="dxa" w:w="1728"/>
+          </w:tcPr>
+          <w:p>
+            <w:r>
               <w:t>1</w:t>
-            </w:r>
-          </w:p>
-        </w:tc>
-        <w:tc>
-          <w:tcPr>
-            <w:tcW w:type="dxa" w:w="1728"/>
-          </w:tcPr>
-          <w:p>
-            <w:r>
-              <w:t>2</w:t>
             </w:r>
           </w:p>
         </w:tc>
@@ -635,7 +649,7 @@
           </w:tcPr>
           <w:p>
             <w:r>
-              <w:t>87</w:t>
+              <w:t>106</w:t>
             </w:r>
           </w:p>
         </w:tc>
@@ -665,7 +679,7 @@
           </w:tcPr>
           <w:p>
             <w:r>
-              <w:t>87</w:t>
+              <w:t>106</w:t>
             </w:r>
           </w:p>
         </w:tc>
@@ -690,10 +704,10 @@
         <w:rPr>
           <w:b/>
         </w:rPr>
-        <w:t xml:space="preserve">LIVE_PRECINCT (20): </w:t>
+        <w:t xml:space="preserve">LIVE_PRECINCT (21): </w:t>
       </w:r>
       <w:r>
-        <w:t>Bell (low), Comal (low), Dallas (high), Denton (high), El Paso (high), Fort Bend (high), Galveston (high), Harris (med), Hidalgo (high), Hunt (high), Kaufman (high), Kendall (high), Midland (high), Montague (high), Rockwall (high), Rusk (high), Tarrant (high), Travis (high), Victoria (high), Wood (high)</w:t>
+        <w:t>Bell (low), Bexar (high), Comal (low), Dallas (high), Denton (high), El Paso (high), Fort Bend (high), Galveston (high), Harris (med), Hidalgo (high), Hunt (high), Kaufman (high), Kendall (high), Midland (high), Montague (high), Rockwall (high), Rusk (high), Tarrant (high), Travis (high), Victoria (high), Wood (high)</w:t>
       </w:r>
     </w:p>
     <w:p>
@@ -701,10 +715,10 @@
         <w:rPr>
           <w:b/>
         </w:rPr>
-        <w:t xml:space="preserve">PRECINCT_END_OF_NIGHT (19): </w:t>
+        <w:t xml:space="preserve">PRECINCT_END_OF_NIGHT (21): </w:t>
       </w:r>
       <w:r>
-        <w:t>Bandera (low), Bastrop (high), Burnet (low), Chambers (med), Cochran (med), Cooke (med), DeWitt (low), Fayette (med), Gregg (high), Hemphill (med), Hopkins (low), Houston (med), Hutchinson (med), Lamar (high), Liberty (med), Lipscomb (med), Lynn (med), Ochiltree (low), Robertson (high)</w:t>
+        <w:t>Bandera (low), Bastrop (high), Bowie (low), Burnet (low), Chambers (med), Cochran (med), Cooke (med), DeWitt (low), Donley (low), Fayette (med), Gillespie (low), Glasscock (low), Gregg (high), Hemphill (med), Hopkins (low), Houston (med), Jim Hogg (low), Liberty (med), Lipscomb (med), Lynn (med), Ochiltree (low)</w:t>
       </w:r>
     </w:p>
     <w:p>
@@ -818,7 +832,7 @@
           </w:tcPr>
           <w:p>
             <w:r>
-              <w:t>11</w:t>
+              <w:t>10</w:t>
             </w:r>
           </w:p>
         </w:tc>
@@ -828,7 +842,7 @@
           </w:tcPr>
           <w:p>
             <w:r>
-              <w:t>76</w:t>
+              <w:t>54</w:t>
             </w:r>
           </w:p>
         </w:tc>
@@ -848,7 +862,7 @@
           </w:tcPr>
           <w:p>
             <w:r>
-              <w:t>145</w:t>
+              <w:t>168</w:t>
             </w:r>
           </w:p>
         </w:tc>
@@ -880,7 +894,7 @@
           </w:tcPr>
           <w:p>
             <w:r>
-              <w:t>15</w:t>
+              <w:t>14</w:t>
             </w:r>
           </w:p>
         </w:tc>
@@ -890,7 +904,7 @@
           </w:tcPr>
           <w:p>
             <w:r>
-              <w:t>92</w:t>
+              <w:t>64</w:t>
             </w:r>
           </w:p>
         </w:tc>
@@ -900,7 +914,7 @@
           </w:tcPr>
           <w:p>
             <w:r>
-              <w:t>2</w:t>
+              <w:t>0</w:t>
             </w:r>
           </w:p>
         </w:tc>
@@ -910,7 +924,7 @@
           </w:tcPr>
           <w:p>
             <w:r>
-              <w:t>123</w:t>
+              <w:t>154</w:t>
             </w:r>
           </w:p>
         </w:tc>
@@ -942,7 +956,7 @@
           </w:tcPr>
           <w:p>
             <w:r>
-              <w:t>25</w:t>
+              <w:t>24</w:t>
             </w:r>
           </w:p>
         </w:tc>
@@ -952,7 +966,7 @@
           </w:tcPr>
           <w:p>
             <w:r>
-              <w:t>103</w:t>
+              <w:t>82</w:t>
             </w:r>
           </w:p>
         </w:tc>
@@ -962,7 +976,7 @@
           </w:tcPr>
           <w:p>
             <w:r>
-              <w:t>2</w:t>
+              <w:t>0</w:t>
             </w:r>
           </w:p>
         </w:tc>
@@ -972,7 +986,7 @@
           </w:tcPr>
           <w:p>
             <w:r>
-              <w:t>111</w:t>
+              <w:t>135</w:t>
             </w:r>
           </w:p>
         </w:tc>
@@ -981,7 +995,7 @@
     <w:p/>
     <w:p>
       <w:r>
-        <w:t>Of 762 county-elections, 383 were determined: 72 by check 1 (vendor update log), 309 by check 2 (county-posted reports), and 2 by check 3 (Wayback captures). 379 remain UNDETERMINED.</w:t>
+        <w:t>Of 762 county-elections, 305 were determined: 72 by check 1 (vendor update log), 231 by check 2 (county-posted reports), and 2 by check 3 (Wayback captures). 457 remain UNDETERMINED.</w:t>
       </w:r>
     </w:p>
     <w:p>
@@ -1193,6 +1207,11 @@
     </w:p>
     <w:p>
       <w:r>
+        <w:t>Three rules were tightened during the run and applied to every county by dedicated passes, so results do not depend on which agent handled a county: precinct numbers count only if they include election-day votes and repeated identical numbers are one release; LATER needs positive election-night evidence; and END from county-posted reports needs an election-night upload time when one is known.</w:t>
+      </w:r>
+    </w:p>
+    <w:p>
+      <w:r>
         <w:t>Selected counties were re-checked by independent verifier agents working blind: every LIVE_PRECINCT and PRECINCT_END_OF_NIGHT, every low-confidence tag, and a seeded random 10 percent of the rest. Disagreement sets the tag to UNKNOWN.</w:t>
       </w:r>
     </w:p>
@@ -1206,7 +1225,7 @@
     </w:p>
     <w:p>
       <w:r>
-        <w:t>5 counties were re-checked blind; 4 agreed with the research tag. Disagreements, set to UNKNOWN: Bexar. Per-county detail is in phase1/verification/ and phase1/verification_log.md.</w:t>
+        <w:t>119 counties were re-checked blind; 101 agreed with the research tag. Disagreements, set to UNKNOWN: Cherokee, Childress, Dimmit, Foard, Garza, Hamilton, Haskell, Irion, Jasper, Kent, Lamar, Robertson, San Saba, Scurry, Terrell, Throckmorton, Tyler, Zapata. Per-county detail is in phase1/verification/ and phase1/verification_log.md.</w:t>
       </w:r>
     </w:p>
     <w:p>
@@ -1230,7 +1249,7 @@
         <w:pStyle w:val="ListBullet"/>
       </w:pPr>
       <w:r>
-        <w:t>87 counties are UNKNOWN. Most post election-night reports that are later overwritten, use web servers that do not report upload times, or block automated requests.</w:t>
+        <w:t>106 counties are UNKNOWN. Most post election-night reports that are later overwritten, use web servers that do not report upload times, or block automated requests.</w:t>
       </w:r>
     </w:p>
     <w:p>
@@ -2541,17 +2560,17 @@
           </w:tcPr>
           <w:p>
             <w:r>
-              <w:t>UNKNOWN</w:t>
-            </w:r>
-          </w:p>
-        </w:tc>
-        <w:tc>
-          <w:tcPr>
-            <w:tcW w:type="dxa" w:w="1080"/>
-          </w:tcPr>
-          <w:p>
-            <w:r>
-              <w:t>low</w:t>
+              <w:t>LIVE_PRECINCT</w:t>
+            </w:r>
+          </w:p>
+        </w:tc>
+        <w:tc>
+          <w:tcPr>
+            <w:tcW w:type="dxa" w:w="1080"/>
+          </w:tcPr>
+          <w:p>
+            <w:r>
+              <w:t>high</w:t>
             </w:r>
           </w:p>
         </w:tc>
@@ -2663,7 +2682,7 @@
           </w:tcPr>
           <w:p>
             <w:r>
-              <w:t>LATER (2)</w:t>
+              <w:t>UND</w:t>
             </w:r>
           </w:p>
         </w:tc>
@@ -2869,37 +2888,37 @@
           </w:tcPr>
           <w:p>
             <w:r>
-              <w:t>COUNTY_ONLY_PRECINCT_AT_CANVASS</w:t>
-            </w:r>
-          </w:p>
-        </w:tc>
-        <w:tc>
-          <w:tcPr>
-            <w:tcW w:type="dxa" w:w="1080"/>
-          </w:tcPr>
-          <w:p>
-            <w:r>
-              <w:t>med</w:t>
-            </w:r>
-          </w:p>
-        </w:tc>
-        <w:tc>
-          <w:tcPr>
-            <w:tcW w:type="dxa" w:w="1080"/>
-          </w:tcPr>
-          <w:p>
-            <w:r>
-              <w:t>LATER (2)</w:t>
-            </w:r>
-          </w:p>
-        </w:tc>
-        <w:tc>
-          <w:tcPr>
-            <w:tcW w:type="dxa" w:w="1080"/>
-          </w:tcPr>
-          <w:p>
-            <w:r>
-              <w:t>LATER (2)</w:t>
+              <w:t>PRECINCT_END_OF_NIGHT</w:t>
+            </w:r>
+          </w:p>
+        </w:tc>
+        <w:tc>
+          <w:tcPr>
+            <w:tcW w:type="dxa" w:w="1080"/>
+          </w:tcPr>
+          <w:p>
+            <w:r>
+              <w:t>low</w:t>
+            </w:r>
+          </w:p>
+        </w:tc>
+        <w:tc>
+          <w:tcPr>
+            <w:tcW w:type="dxa" w:w="1080"/>
+          </w:tcPr>
+          <w:p>
+            <w:r>
+              <w:t>UND</w:t>
+            </w:r>
+          </w:p>
+        </w:tc>
+        <w:tc>
+          <w:tcPr>
+            <w:tcW w:type="dxa" w:w="1080"/>
+          </w:tcPr>
+          <w:p>
+            <w:r>
+              <w:t>UND</w:t>
             </w:r>
           </w:p>
         </w:tc>
@@ -3043,17 +3062,17 @@
           </w:tcPr>
           <w:p>
             <w:r>
-              <w:t>med</w:t>
-            </w:r>
-          </w:p>
-        </w:tc>
-        <w:tc>
-          <w:tcPr>
-            <w:tcW w:type="dxa" w:w="1080"/>
-          </w:tcPr>
-          <w:p>
-            <w:r>
-              <w:t>LATER (2)</w:t>
+              <w:t>low</w:t>
+            </w:r>
+          </w:p>
+        </w:tc>
+        <w:tc>
+          <w:tcPr>
+            <w:tcW w:type="dxa" w:w="1080"/>
+          </w:tcPr>
+          <w:p>
+            <w:r>
+              <w:t>UND</w:t>
             </w:r>
           </w:p>
         </w:tc>
@@ -3279,27 +3298,27 @@
           </w:tcPr>
           <w:p>
             <w:r>
-              <w:t>COUNTY_ONLY_PRECINCT_AT_CANVASS</w:t>
-            </w:r>
-          </w:p>
-        </w:tc>
-        <w:tc>
-          <w:tcPr>
-            <w:tcW w:type="dxa" w:w="1080"/>
-          </w:tcPr>
-          <w:p>
-            <w:r>
-              <w:t>med</w:t>
-            </w:r>
-          </w:p>
-        </w:tc>
-        <w:tc>
-          <w:tcPr>
-            <w:tcW w:type="dxa" w:w="1080"/>
-          </w:tcPr>
-          <w:p>
-            <w:r>
-              <w:t>LATER (2)</w:t>
+              <w:t>UNKNOWN</w:t>
+            </w:r>
+          </w:p>
+        </w:tc>
+        <w:tc>
+          <w:tcPr>
+            <w:tcW w:type="dxa" w:w="1080"/>
+          </w:tcPr>
+          <w:p>
+            <w:r>
+              <w:t>low</w:t>
+            </w:r>
+          </w:p>
+        </w:tc>
+        <w:tc>
+          <w:tcPr>
+            <w:tcW w:type="dxa" w:w="1080"/>
+          </w:tcPr>
+          <w:p>
+            <w:r>
+              <w:t>UND</w:t>
             </w:r>
           </w:p>
         </w:tc>
@@ -3607,17 +3626,17 @@
           </w:tcPr>
           <w:p>
             <w:r>
-              <w:t>COUNTY_ONLY_PRECINCT_AT_CANVASS</w:t>
-            </w:r>
-          </w:p>
-        </w:tc>
-        <w:tc>
-          <w:tcPr>
-            <w:tcW w:type="dxa" w:w="1080"/>
-          </w:tcPr>
-          <w:p>
-            <w:r>
-              <w:t>med</w:t>
+              <w:t>UNKNOWN</w:t>
+            </w:r>
+          </w:p>
+        </w:tc>
+        <w:tc>
+          <w:tcPr>
+            <w:tcW w:type="dxa" w:w="1080"/>
+          </w:tcPr>
+          <w:p>
+            <w:r>
+              <w:t>low</w:t>
             </w:r>
           </w:p>
         </w:tc>
@@ -3637,17 +3656,17 @@
           </w:tcPr>
           <w:p>
             <w:r>
-              <w:t>LATER (2)</w:t>
-            </w:r>
-          </w:p>
-        </w:tc>
-        <w:tc>
-          <w:tcPr>
-            <w:tcW w:type="dxa" w:w="1080"/>
-          </w:tcPr>
-          <w:p>
-            <w:r>
-              <w:t>LATER (2)</w:t>
+              <w:t>UND</w:t>
+            </w:r>
+          </w:p>
+        </w:tc>
+        <w:tc>
+          <w:tcPr>
+            <w:tcW w:type="dxa" w:w="1080"/>
+          </w:tcPr>
+          <w:p>
+            <w:r>
+              <w:t>UND</w:t>
             </w:r>
           </w:p>
         </w:tc>
@@ -4109,27 +4128,27 @@
           </w:tcPr>
           <w:p>
             <w:r>
-              <w:t>med</w:t>
-            </w:r>
-          </w:p>
-        </w:tc>
-        <w:tc>
-          <w:tcPr>
-            <w:tcW w:type="dxa" w:w="1080"/>
-          </w:tcPr>
-          <w:p>
-            <w:r>
-              <w:t>LATER (2)</w:t>
-            </w:r>
-          </w:p>
-        </w:tc>
-        <w:tc>
-          <w:tcPr>
-            <w:tcW w:type="dxa" w:w="1080"/>
-          </w:tcPr>
-          <w:p>
-            <w:r>
-              <w:t>LATER (2)</w:t>
+              <w:t>low</w:t>
+            </w:r>
+          </w:p>
+        </w:tc>
+        <w:tc>
+          <w:tcPr>
+            <w:tcW w:type="dxa" w:w="1080"/>
+          </w:tcPr>
+          <w:p>
+            <w:r>
+              <w:t>UND</w:t>
+            </w:r>
+          </w:p>
+        </w:tc>
+        <w:tc>
+          <w:tcPr>
+            <w:tcW w:type="dxa" w:w="1080"/>
+          </w:tcPr>
+          <w:p>
+            <w:r>
+              <w:t>UND</w:t>
             </w:r>
           </w:p>
         </w:tc>
@@ -4181,17 +4200,17 @@
           </w:tcPr>
           <w:p>
             <w:r>
-              <w:t>NO_SITE_OR_SOS_ONLY</w:t>
-            </w:r>
-          </w:p>
-        </w:tc>
-        <w:tc>
-          <w:tcPr>
-            <w:tcW w:type="dxa" w:w="1080"/>
-          </w:tcPr>
-          <w:p>
-            <w:r>
-              <w:t>med</w:t>
+              <w:t>UNKNOWN</w:t>
+            </w:r>
+          </w:p>
+        </w:tc>
+        <w:tc>
+          <w:tcPr>
+            <w:tcW w:type="dxa" w:w="1080"/>
+          </w:tcPr>
+          <w:p>
+            <w:r>
+              <w:t>low</w:t>
             </w:r>
           </w:p>
         </w:tc>
@@ -4211,17 +4230,17 @@
           </w:tcPr>
           <w:p>
             <w:r>
-              <w:t>NONE (2)</w:t>
-            </w:r>
-          </w:p>
-        </w:tc>
-        <w:tc>
-          <w:tcPr>
-            <w:tcW w:type="dxa" w:w="1080"/>
-          </w:tcPr>
-          <w:p>
-            <w:r>
-              <w:t>NONE (2)</w:t>
+              <w:t>UND</w:t>
+            </w:r>
+          </w:p>
+        </w:tc>
+        <w:tc>
+          <w:tcPr>
+            <w:tcW w:type="dxa" w:w="1080"/>
+          </w:tcPr>
+          <w:p>
+            <w:r>
+              <w:t>UND</w:t>
             </w:r>
           </w:p>
         </w:tc>
@@ -4345,17 +4364,17 @@
           </w:tcPr>
           <w:p>
             <w:r>
-              <w:t>COUNTY_ONLY_PRECINCT_AT_CANVASS</w:t>
-            </w:r>
-          </w:p>
-        </w:tc>
-        <w:tc>
-          <w:tcPr>
-            <w:tcW w:type="dxa" w:w="1080"/>
-          </w:tcPr>
-          <w:p>
-            <w:r>
-              <w:t>med</w:t>
+              <w:t>UNKNOWN</w:t>
+            </w:r>
+          </w:p>
+        </w:tc>
+        <w:tc>
+          <w:tcPr>
+            <w:tcW w:type="dxa" w:w="1080"/>
+          </w:tcPr>
+          <w:p>
+            <w:r>
+              <w:t>low</w:t>
             </w:r>
           </w:p>
         </w:tc>
@@ -4375,7 +4394,7 @@
           </w:tcPr>
           <w:p>
             <w:r>
-              <w:t>LATER (2)</w:t>
+              <w:t>UND</w:t>
             </w:r>
           </w:p>
         </w:tc>
@@ -4427,7 +4446,7 @@
           </w:tcPr>
           <w:p>
             <w:r>
-              <w:t>UNKNOWN</w:t>
+              <w:t>COUNTY_ONLY_PRECINCT_AT_CANVASS</w:t>
             </w:r>
           </w:p>
         </w:tc>
@@ -4467,7 +4486,7 @@
           </w:tcPr>
           <w:p>
             <w:r>
-              <w:t>NONE (2)</w:t>
+              <w:t>UND</w:t>
             </w:r>
           </w:p>
         </w:tc>
@@ -4611,7 +4630,7 @@
           </w:tcPr>
           <w:p>
             <w:r>
-              <w:t>LATER (2)</w:t>
+              <w:t>UND</w:t>
             </w:r>
           </w:p>
         </w:tc>
@@ -6487,7 +6506,7 @@
           </w:tcPr>
           <w:p>
             <w:r>
-              <w:t>med</w:t>
+              <w:t>low</w:t>
             </w:r>
           </w:p>
         </w:tc>
@@ -6507,7 +6526,7 @@
           </w:tcPr>
           <w:p>
             <w:r>
-              <w:t>LATER (2)</w:t>
+              <w:t>UND</w:t>
             </w:r>
           </w:p>
         </w:tc>
@@ -6559,7 +6578,7 @@
           </w:tcPr>
           <w:p>
             <w:r>
-              <w:t>NO_SITE_OR_SOS_ONLY</w:t>
+              <w:t>UNKNOWN</w:t>
             </w:r>
           </w:p>
         </w:tc>
@@ -6589,7 +6608,7 @@
           </w:tcPr>
           <w:p>
             <w:r>
-              <w:t>NONE (2)</w:t>
+              <w:t>UND</w:t>
             </w:r>
           </w:p>
         </w:tc>
@@ -6641,7 +6660,7 @@
           </w:tcPr>
           <w:p>
             <w:r>
-              <w:t>UNKNOWN</w:t>
+              <w:t>PRECINCT_END_OF_NIGHT</w:t>
             </w:r>
           </w:p>
         </w:tc>
@@ -6661,7 +6680,7 @@
           </w:tcPr>
           <w:p>
             <w:r>
-              <w:t>LATER (2)</w:t>
+              <w:t>UND</w:t>
             </w:r>
           </w:p>
         </w:tc>
@@ -6815,27 +6834,27 @@
           </w:tcPr>
           <w:p>
             <w:r>
-              <w:t>med</w:t>
-            </w:r>
-          </w:p>
-        </w:tc>
-        <w:tc>
-          <w:tcPr>
-            <w:tcW w:type="dxa" w:w="1080"/>
-          </w:tcPr>
-          <w:p>
-            <w:r>
-              <w:t>LATER (2)</w:t>
-            </w:r>
-          </w:p>
-        </w:tc>
-        <w:tc>
-          <w:tcPr>
-            <w:tcW w:type="dxa" w:w="1080"/>
-          </w:tcPr>
-          <w:p>
-            <w:r>
-              <w:t>LATER (2)</w:t>
+              <w:t>low</w:t>
+            </w:r>
+          </w:p>
+        </w:tc>
+        <w:tc>
+          <w:tcPr>
+            <w:tcW w:type="dxa" w:w="1080"/>
+          </w:tcPr>
+          <w:p>
+            <w:r>
+              <w:t>UND</w:t>
+            </w:r>
+          </w:p>
+        </w:tc>
+        <w:tc>
+          <w:tcPr>
+            <w:tcW w:type="dxa" w:w="1080"/>
+          </w:tcPr>
+          <w:p>
+            <w:r>
+              <w:t>UND</w:t>
             </w:r>
           </w:p>
         </w:tc>
@@ -7553,7 +7572,7 @@
           </w:tcPr>
           <w:p>
             <w:r>
-              <w:t>med</w:t>
+              <w:t>low</w:t>
             </w:r>
           </w:p>
         </w:tc>
@@ -7573,17 +7592,17 @@
           </w:tcPr>
           <w:p>
             <w:r>
-              <w:t>LATER (2)</w:t>
-            </w:r>
-          </w:p>
-        </w:tc>
-        <w:tc>
-          <w:tcPr>
-            <w:tcW w:type="dxa" w:w="1080"/>
-          </w:tcPr>
-          <w:p>
-            <w:r>
-              <w:t>LATER (2)</w:t>
+              <w:t>UND</w:t>
+            </w:r>
+          </w:p>
+        </w:tc>
+        <w:tc>
+          <w:tcPr>
+            <w:tcW w:type="dxa" w:w="1080"/>
+          </w:tcPr>
+          <w:p>
+            <w:r>
+              <w:t>UND</w:t>
             </w:r>
           </w:p>
         </w:tc>
@@ -7707,7 +7726,7 @@
           </w:tcPr>
           <w:p>
             <w:r>
-              <w:t>COUNTY_ONLY_PRECINCT_AT_CANVASS</w:t>
+              <w:t>UNKNOWN</w:t>
             </w:r>
           </w:p>
         </w:tc>
@@ -7737,7 +7756,7 @@
           </w:tcPr>
           <w:p>
             <w:r>
-              <w:t>LATER (2)</w:t>
+              <w:t>UND</w:t>
             </w:r>
           </w:p>
         </w:tc>
@@ -8045,27 +8064,27 @@
           </w:tcPr>
           <w:p>
             <w:r>
-              <w:t>med</w:t>
-            </w:r>
-          </w:p>
-        </w:tc>
-        <w:tc>
-          <w:tcPr>
-            <w:tcW w:type="dxa" w:w="1080"/>
-          </w:tcPr>
-          <w:p>
-            <w:r>
-              <w:t>LATER (2)</w:t>
-            </w:r>
-          </w:p>
-        </w:tc>
-        <w:tc>
-          <w:tcPr>
-            <w:tcW w:type="dxa" w:w="1080"/>
-          </w:tcPr>
-          <w:p>
-            <w:r>
-              <w:t>LATER (2)</w:t>
+              <w:t>low</w:t>
+            </w:r>
+          </w:p>
+        </w:tc>
+        <w:tc>
+          <w:tcPr>
+            <w:tcW w:type="dxa" w:w="1080"/>
+          </w:tcPr>
+          <w:p>
+            <w:r>
+              <w:t>UND</w:t>
+            </w:r>
+          </w:p>
+        </w:tc>
+        <w:tc>
+          <w:tcPr>
+            <w:tcW w:type="dxa" w:w="1080"/>
+          </w:tcPr>
+          <w:p>
+            <w:r>
+              <w:t>UND</w:t>
             </w:r>
           </w:p>
         </w:tc>
@@ -8127,7 +8146,7 @@
           </w:tcPr>
           <w:p>
             <w:r>
-              <w:t>med</w:t>
+              <w:t>low</w:t>
             </w:r>
           </w:p>
         </w:tc>
@@ -8147,7 +8166,7 @@
           </w:tcPr>
           <w:p>
             <w:r>
-              <w:t>LATER (2)</w:t>
+              <w:t>UND</w:t>
             </w:r>
           </w:p>
         </w:tc>
@@ -8281,7 +8300,7 @@
           </w:tcPr>
           <w:p>
             <w:r>
-              <w:t>COUNTY_ONLY_PRECINCT_AT_CANVASS</w:t>
+              <w:t>UNKNOWN</w:t>
             </w:r>
           </w:p>
         </w:tc>
@@ -8311,7 +8330,7 @@
           </w:tcPr>
           <w:p>
             <w:r>
-              <w:t>LATER (2)</w:t>
+              <w:t>UND</w:t>
             </w:r>
           </w:p>
         </w:tc>
@@ -8363,7 +8382,7 @@
           </w:tcPr>
           <w:p>
             <w:r>
-              <w:t>UNKNOWN</w:t>
+              <w:t>PRECINCT_END_OF_NIGHT</w:t>
             </w:r>
           </w:p>
         </w:tc>
@@ -8393,7 +8412,7 @@
           </w:tcPr>
           <w:p>
             <w:r>
-              <w:t>LATER (2)</w:t>
+              <w:t>UND</w:t>
             </w:r>
           </w:p>
         </w:tc>
@@ -8445,27 +8464,27 @@
           </w:tcPr>
           <w:p>
             <w:r>
-              <w:t>COUNTY_ONLY_PRECINCT_AT_CANVASS</w:t>
-            </w:r>
-          </w:p>
-        </w:tc>
-        <w:tc>
-          <w:tcPr>
-            <w:tcW w:type="dxa" w:w="1080"/>
-          </w:tcPr>
-          <w:p>
-            <w:r>
-              <w:t>med</w:t>
-            </w:r>
-          </w:p>
-        </w:tc>
-        <w:tc>
-          <w:tcPr>
-            <w:tcW w:type="dxa" w:w="1080"/>
-          </w:tcPr>
-          <w:p>
-            <w:r>
-              <w:t>LATER (2)</w:t>
+              <w:t>PRECINCT_END_OF_NIGHT</w:t>
+            </w:r>
+          </w:p>
+        </w:tc>
+        <w:tc>
+          <w:tcPr>
+            <w:tcW w:type="dxa" w:w="1080"/>
+          </w:tcPr>
+          <w:p>
+            <w:r>
+              <w:t>low</w:t>
+            </w:r>
+          </w:p>
+        </w:tc>
+        <w:tc>
+          <w:tcPr>
+            <w:tcW w:type="dxa" w:w="1080"/>
+          </w:tcPr>
+          <w:p>
+            <w:r>
+              <w:t>UND</w:t>
             </w:r>
           </w:p>
         </w:tc>
@@ -8485,7 +8504,7 @@
           </w:tcPr>
           <w:p>
             <w:r>
-              <w:t>LATER (2)</w:t>
+              <w:t>UND</w:t>
             </w:r>
           </w:p>
         </w:tc>
@@ -8557,7 +8576,7 @@
           </w:tcPr>
           <w:p>
             <w:r>
-              <w:t>LATER (2)</w:t>
+              <w:t>UND</w:t>
             </w:r>
           </w:p>
         </w:tc>
@@ -8701,27 +8720,27 @@
           </w:tcPr>
           <w:p>
             <w:r>
-              <w:t>med</w:t>
-            </w:r>
-          </w:p>
-        </w:tc>
-        <w:tc>
-          <w:tcPr>
-            <w:tcW w:type="dxa" w:w="1080"/>
-          </w:tcPr>
-          <w:p>
-            <w:r>
-              <w:t>LATER (2)</w:t>
-            </w:r>
-          </w:p>
-        </w:tc>
-        <w:tc>
-          <w:tcPr>
-            <w:tcW w:type="dxa" w:w="1080"/>
-          </w:tcPr>
-          <w:p>
-            <w:r>
-              <w:t>LATER (2)</w:t>
+              <w:t>low</w:t>
+            </w:r>
+          </w:p>
+        </w:tc>
+        <w:tc>
+          <w:tcPr>
+            <w:tcW w:type="dxa" w:w="1080"/>
+          </w:tcPr>
+          <w:p>
+            <w:r>
+              <w:t>UND</w:t>
+            </w:r>
+          </w:p>
+        </w:tc>
+        <w:tc>
+          <w:tcPr>
+            <w:tcW w:type="dxa" w:w="1080"/>
+          </w:tcPr>
+          <w:p>
+            <w:r>
+              <w:t>UND</w:t>
             </w:r>
           </w:p>
         </w:tc>
@@ -9265,7 +9284,7 @@
           </w:tcPr>
           <w:p>
             <w:r>
-              <w:t>COUNTY_ONLY_PRECINCT_AT_CANVASS</w:t>
+              <w:t>UNKNOWN</w:t>
             </w:r>
           </w:p>
         </w:tc>
@@ -9305,7 +9324,7 @@
           </w:tcPr>
           <w:p>
             <w:r>
-              <w:t>LATER (2)</w:t>
+              <w:t>UND</w:t>
             </w:r>
           </w:p>
         </w:tc>
@@ -9429,17 +9448,17 @@
           </w:tcPr>
           <w:p>
             <w:r>
-              <w:t>COUNTY_ONLY_PRECINCT_AT_CANVASS</w:t>
-            </w:r>
-          </w:p>
-        </w:tc>
-        <w:tc>
-          <w:tcPr>
-            <w:tcW w:type="dxa" w:w="1080"/>
-          </w:tcPr>
-          <w:p>
-            <w:r>
-              <w:t>med</w:t>
+              <w:t>UNKNOWN</w:t>
+            </w:r>
+          </w:p>
+        </w:tc>
+        <w:tc>
+          <w:tcPr>
+            <w:tcW w:type="dxa" w:w="1080"/>
+          </w:tcPr>
+          <w:p>
+            <w:r>
+              <w:t>low</w:t>
             </w:r>
           </w:p>
         </w:tc>
@@ -9459,17 +9478,17 @@
           </w:tcPr>
           <w:p>
             <w:r>
-              <w:t>LATER (2)</w:t>
-            </w:r>
-          </w:p>
-        </w:tc>
-        <w:tc>
-          <w:tcPr>
-            <w:tcW w:type="dxa" w:w="1080"/>
-          </w:tcPr>
-          <w:p>
-            <w:r>
-              <w:t>LATER (2)</w:t>
+              <w:t>UND</w:t>
+            </w:r>
+          </w:p>
+        </w:tc>
+        <w:tc>
+          <w:tcPr>
+            <w:tcW w:type="dxa" w:w="1080"/>
+          </w:tcPr>
+          <w:p>
+            <w:r>
+              <w:t>UND</w:t>
             </w:r>
           </w:p>
         </w:tc>
@@ -9767,7 +9786,7 @@
           </w:tcPr>
           <w:p>
             <w:r>
-              <w:t>med</w:t>
+              <w:t>low</w:t>
             </w:r>
           </w:p>
         </w:tc>
@@ -9797,7 +9816,7 @@
           </w:tcPr>
           <w:p>
             <w:r>
-              <w:t>LATER (2)</w:t>
+              <w:t>UND</w:t>
             </w:r>
           </w:p>
         </w:tc>
@@ -10781,7 +10800,7 @@
           </w:tcPr>
           <w:p>
             <w:r>
-              <w:t>LATER (2)</w:t>
+              <w:t>UND</w:t>
             </w:r>
           </w:p>
         </w:tc>
@@ -10905,47 +10924,47 @@
           </w:tcPr>
           <w:p>
             <w:r>
-              <w:t>PRECINCT_END_OF_NIGHT</w:t>
-            </w:r>
-          </w:p>
-        </w:tc>
-        <w:tc>
-          <w:tcPr>
-            <w:tcW w:type="dxa" w:w="1080"/>
-          </w:tcPr>
-          <w:p>
-            <w:r>
-              <w:t>med</w:t>
-            </w:r>
-          </w:p>
-        </w:tc>
-        <w:tc>
-          <w:tcPr>
-            <w:tcW w:type="dxa" w:w="1080"/>
-          </w:tcPr>
-          <w:p>
-            <w:r>
-              <w:t>END (2)</w:t>
-            </w:r>
-          </w:p>
-        </w:tc>
-        <w:tc>
-          <w:tcPr>
-            <w:tcW w:type="dxa" w:w="1080"/>
-          </w:tcPr>
-          <w:p>
-            <w:r>
-              <w:t>END (2)</w:t>
-            </w:r>
-          </w:p>
-        </w:tc>
-        <w:tc>
-          <w:tcPr>
-            <w:tcW w:type="dxa" w:w="1080"/>
-          </w:tcPr>
-          <w:p>
-            <w:r>
-              <w:t>END (2)</w:t>
+              <w:t>UNKNOWN</w:t>
+            </w:r>
+          </w:p>
+        </w:tc>
+        <w:tc>
+          <w:tcPr>
+            <w:tcW w:type="dxa" w:w="1080"/>
+          </w:tcPr>
+          <w:p>
+            <w:r>
+              <w:t>low</w:t>
+            </w:r>
+          </w:p>
+        </w:tc>
+        <w:tc>
+          <w:tcPr>
+            <w:tcW w:type="dxa" w:w="1080"/>
+          </w:tcPr>
+          <w:p>
+            <w:r>
+              <w:t>UND</w:t>
+            </w:r>
+          </w:p>
+        </w:tc>
+        <w:tc>
+          <w:tcPr>
+            <w:tcW w:type="dxa" w:w="1080"/>
+          </w:tcPr>
+          <w:p>
+            <w:r>
+              <w:t>UND</w:t>
+            </w:r>
+          </w:p>
+        </w:tc>
+        <w:tc>
+          <w:tcPr>
+            <w:tcW w:type="dxa" w:w="1080"/>
+          </w:tcPr>
+          <w:p>
+            <w:r>
+              <w:t>UND</w:t>
             </w:r>
           </w:p>
         </w:tc>
@@ -10987,7 +11006,7 @@
           </w:tcPr>
           <w:p>
             <w:r>
-              <w:t>COUNTY_ONLY_PRECINCT_AT_CANVASS</w:t>
+              <w:t>UNKNOWN</w:t>
             </w:r>
           </w:p>
         </w:tc>
@@ -11017,7 +11036,7 @@
           </w:tcPr>
           <w:p>
             <w:r>
-              <w:t>LATER (2)</w:t>
+              <w:t>UND</w:t>
             </w:r>
           </w:p>
         </w:tc>
@@ -11233,7 +11252,7 @@
           </w:tcPr>
           <w:p>
             <w:r>
-              <w:t>COUNTY_ONLY_PRECINCT_AT_CANVASS</w:t>
+              <w:t>UNKNOWN</w:t>
             </w:r>
           </w:p>
         </w:tc>
@@ -11263,7 +11282,7 @@
           </w:tcPr>
           <w:p>
             <w:r>
-              <w:t>LATER (2)</w:t>
+              <w:t>UND</w:t>
             </w:r>
           </w:p>
         </w:tc>
@@ -11325,27 +11344,27 @@
           </w:tcPr>
           <w:p>
             <w:r>
-              <w:t>med</w:t>
-            </w:r>
-          </w:p>
-        </w:tc>
-        <w:tc>
-          <w:tcPr>
-            <w:tcW w:type="dxa" w:w="1080"/>
-          </w:tcPr>
-          <w:p>
-            <w:r>
-              <w:t>LATER (2)</w:t>
-            </w:r>
-          </w:p>
-        </w:tc>
-        <w:tc>
-          <w:tcPr>
-            <w:tcW w:type="dxa" w:w="1080"/>
-          </w:tcPr>
-          <w:p>
-            <w:r>
-              <w:t>LATER (2)</w:t>
+              <w:t>low</w:t>
+            </w:r>
+          </w:p>
+        </w:tc>
+        <w:tc>
+          <w:tcPr>
+            <w:tcW w:type="dxa" w:w="1080"/>
+          </w:tcPr>
+          <w:p>
+            <w:r>
+              <w:t>UND</w:t>
+            </w:r>
+          </w:p>
+        </w:tc>
+        <w:tc>
+          <w:tcPr>
+            <w:tcW w:type="dxa" w:w="1080"/>
+          </w:tcPr>
+          <w:p>
+            <w:r>
+              <w:t>UND</w:t>
             </w:r>
           </w:p>
         </w:tc>
@@ -11479,27 +11498,27 @@
           </w:tcPr>
           <w:p>
             <w:r>
-              <w:t>COUNTY_ONLY_PRECINCT_AT_CANVASS</w:t>
-            </w:r>
-          </w:p>
-        </w:tc>
-        <w:tc>
-          <w:tcPr>
-            <w:tcW w:type="dxa" w:w="1080"/>
-          </w:tcPr>
-          <w:p>
-            <w:r>
-              <w:t>med</w:t>
-            </w:r>
-          </w:p>
-        </w:tc>
-        <w:tc>
-          <w:tcPr>
-            <w:tcW w:type="dxa" w:w="1080"/>
-          </w:tcPr>
-          <w:p>
-            <w:r>
-              <w:t>LATER (2)</w:t>
+              <w:t>PRECINCT_END_OF_NIGHT</w:t>
+            </w:r>
+          </w:p>
+        </w:tc>
+        <w:tc>
+          <w:tcPr>
+            <w:tcW w:type="dxa" w:w="1080"/>
+          </w:tcPr>
+          <w:p>
+            <w:r>
+              <w:t>low</w:t>
+            </w:r>
+          </w:p>
+        </w:tc>
+        <w:tc>
+          <w:tcPr>
+            <w:tcW w:type="dxa" w:w="1080"/>
+          </w:tcPr>
+          <w:p>
+            <w:r>
+              <w:t>UND</w:t>
             </w:r>
           </w:p>
         </w:tc>
@@ -11519,7 +11538,7 @@
           </w:tcPr>
           <w:p>
             <w:r>
-              <w:t>LATER (2)</w:t>
+              <w:t>UND</w:t>
             </w:r>
           </w:p>
         </w:tc>
@@ -12063,7 +12082,17 @@
           </w:tcPr>
           <w:p>
             <w:r>
-              <w:t>med</w:t>
+              <w:t>low</w:t>
+            </w:r>
+          </w:p>
+        </w:tc>
+        <w:tc>
+          <w:tcPr>
+            <w:tcW w:type="dxa" w:w="1080"/>
+          </w:tcPr>
+          <w:p>
+            <w:r>
+              <w:t>UND</w:t>
             </w:r>
           </w:p>
         </w:tc>
@@ -12083,17 +12112,7 @@
           </w:tcPr>
           <w:p>
             <w:r>
-              <w:t>LATER (2)</w:t>
-            </w:r>
-          </w:p>
-        </w:tc>
-        <w:tc>
-          <w:tcPr>
-            <w:tcW w:type="dxa" w:w="1080"/>
-          </w:tcPr>
-          <w:p>
-            <w:r>
-              <w:t>LATER (2)</w:t>
+              <w:t>UND</w:t>
             </w:r>
           </w:p>
         </w:tc>
@@ -12135,7 +12154,7 @@
           </w:tcPr>
           <w:p>
             <w:r>
-              <w:t>COUNTY_ONLY_PRECINCT_AT_CANVASS</w:t>
+              <w:t>UNKNOWN</w:t>
             </w:r>
           </w:p>
         </w:tc>
@@ -12165,7 +12184,7 @@
           </w:tcPr>
           <w:p>
             <w:r>
-              <w:t>LATER (2)</w:t>
+              <w:t>UND</w:t>
             </w:r>
           </w:p>
         </w:tc>
@@ -12565,7 +12584,7 @@
           </w:tcPr>
           <w:p>
             <w:r>
-              <w:t>LATER (2)</w:t>
+              <w:t>UND</w:t>
             </w:r>
           </w:p>
         </w:tc>
@@ -12791,17 +12810,17 @@
           </w:tcPr>
           <w:p>
             <w:r>
-              <w:t>PRECINCT_END_OF_NIGHT</w:t>
-            </w:r>
-          </w:p>
-        </w:tc>
-        <w:tc>
-          <w:tcPr>
-            <w:tcW w:type="dxa" w:w="1080"/>
-          </w:tcPr>
-          <w:p>
-            <w:r>
-              <w:t>high</w:t>
+              <w:t>UNKNOWN</w:t>
+            </w:r>
+          </w:p>
+        </w:tc>
+        <w:tc>
+          <w:tcPr>
+            <w:tcW w:type="dxa" w:w="1080"/>
+          </w:tcPr>
+          <w:p>
+            <w:r>
+              <w:t>low</w:t>
             </w:r>
           </w:p>
         </w:tc>
@@ -12873,7 +12892,7 @@
           </w:tcPr>
           <w:p>
             <w:r>
-              <w:t>COUNTY_ONLY_PRECINCT_AT_CANVASS</w:t>
+              <w:t>UNKNOWN</w:t>
             </w:r>
           </w:p>
         </w:tc>
@@ -12913,7 +12932,7 @@
           </w:tcPr>
           <w:p>
             <w:r>
-              <w:t>LATER (2)</w:t>
+              <w:t>UND</w:t>
             </w:r>
           </w:p>
         </w:tc>
@@ -13047,7 +13066,7 @@
           </w:tcPr>
           <w:p>
             <w:r>
-              <w:t>med</w:t>
+              <w:t>low</w:t>
             </w:r>
           </w:p>
         </w:tc>
@@ -13067,7 +13086,7 @@
           </w:tcPr>
           <w:p>
             <w:r>
-              <w:t>LATER (2)</w:t>
+              <w:t>UND</w:t>
             </w:r>
           </w:p>
         </w:tc>
@@ -13129,17 +13148,17 @@
           </w:tcPr>
           <w:p>
             <w:r>
-              <w:t>med</w:t>
-            </w:r>
-          </w:p>
-        </w:tc>
-        <w:tc>
-          <w:tcPr>
-            <w:tcW w:type="dxa" w:w="1080"/>
-          </w:tcPr>
-          <w:p>
-            <w:r>
-              <w:t>LATER (2)</w:t>
+              <w:t>low</w:t>
+            </w:r>
+          </w:p>
+        </w:tc>
+        <w:tc>
+          <w:tcPr>
+            <w:tcW w:type="dxa" w:w="1080"/>
+          </w:tcPr>
+          <w:p>
+            <w:r>
+              <w:t>UND</w:t>
             </w:r>
           </w:p>
         </w:tc>
@@ -13201,17 +13220,17 @@
           </w:tcPr>
           <w:p>
             <w:r>
-              <w:t>COUNTY_ONLY_PRECINCT_AT_CANVASS</w:t>
-            </w:r>
-          </w:p>
-        </w:tc>
-        <w:tc>
-          <w:tcPr>
-            <w:tcW w:type="dxa" w:w="1080"/>
-          </w:tcPr>
-          <w:p>
-            <w:r>
-              <w:t>med</w:t>
+              <w:t>UNKNOWN</w:t>
+            </w:r>
+          </w:p>
+        </w:tc>
+        <w:tc>
+          <w:tcPr>
+            <w:tcW w:type="dxa" w:w="1080"/>
+          </w:tcPr>
+          <w:p>
+            <w:r>
+              <w:t>low</w:t>
             </w:r>
           </w:p>
         </w:tc>
@@ -13241,7 +13260,7 @@
           </w:tcPr>
           <w:p>
             <w:r>
-              <w:t>LATER (2)</w:t>
+              <w:t>UND</w:t>
             </w:r>
           </w:p>
         </w:tc>
@@ -13365,37 +13384,37 @@
           </w:tcPr>
           <w:p>
             <w:r>
-              <w:t>COUNTY_ONLY_PRECINCT_AT_CANVASS</w:t>
-            </w:r>
-          </w:p>
-        </w:tc>
-        <w:tc>
-          <w:tcPr>
-            <w:tcW w:type="dxa" w:w="1080"/>
-          </w:tcPr>
-          <w:p>
-            <w:r>
-              <w:t>med</w:t>
-            </w:r>
-          </w:p>
-        </w:tc>
-        <w:tc>
-          <w:tcPr>
-            <w:tcW w:type="dxa" w:w="1080"/>
-          </w:tcPr>
-          <w:p>
-            <w:r>
-              <w:t>LATER (2)</w:t>
-            </w:r>
-          </w:p>
-        </w:tc>
-        <w:tc>
-          <w:tcPr>
-            <w:tcW w:type="dxa" w:w="1080"/>
-          </w:tcPr>
-          <w:p>
-            <w:r>
-              <w:t>LATER (2)</w:t>
+              <w:t>UNKNOWN</w:t>
+            </w:r>
+          </w:p>
+        </w:tc>
+        <w:tc>
+          <w:tcPr>
+            <w:tcW w:type="dxa" w:w="1080"/>
+          </w:tcPr>
+          <w:p>
+            <w:r>
+              <w:t>low</w:t>
+            </w:r>
+          </w:p>
+        </w:tc>
+        <w:tc>
+          <w:tcPr>
+            <w:tcW w:type="dxa" w:w="1080"/>
+          </w:tcPr>
+          <w:p>
+            <w:r>
+              <w:t>UND</w:t>
+            </w:r>
+          </w:p>
+        </w:tc>
+        <w:tc>
+          <w:tcPr>
+            <w:tcW w:type="dxa" w:w="1080"/>
+          </w:tcPr>
+          <w:p>
+            <w:r>
+              <w:t>UND</w:t>
             </w:r>
           </w:p>
         </w:tc>
@@ -14031,7 +14050,7 @@
           </w:tcPr>
           <w:p>
             <w:r>
-              <w:t>med</w:t>
+              <w:t>low</w:t>
             </w:r>
           </w:p>
         </w:tc>
@@ -14051,7 +14070,7 @@
           </w:tcPr>
           <w:p>
             <w:r>
-              <w:t>LATER (2)</w:t>
+              <w:t>UND</w:t>
             </w:r>
           </w:p>
         </w:tc>
@@ -14277,17 +14296,17 @@
           </w:tcPr>
           <w:p>
             <w:r>
-              <w:t>med</w:t>
-            </w:r>
-          </w:p>
-        </w:tc>
-        <w:tc>
-          <w:tcPr>
-            <w:tcW w:type="dxa" w:w="1080"/>
-          </w:tcPr>
-          <w:p>
-            <w:r>
-              <w:t>LATER (2)</w:t>
+              <w:t>low</w:t>
+            </w:r>
+          </w:p>
+        </w:tc>
+        <w:tc>
+          <w:tcPr>
+            <w:tcW w:type="dxa" w:w="1080"/>
+          </w:tcPr>
+          <w:p>
+            <w:r>
+              <w:t>UND</w:t>
             </w:r>
           </w:p>
         </w:tc>
@@ -14461,7 +14480,7 @@
           </w:tcPr>
           <w:p>
             <w:r>
-              <w:t>LATER (2)</w:t>
+              <w:t>UND</w:t>
             </w:r>
           </w:p>
         </w:tc>
@@ -14605,7 +14624,17 @@
           </w:tcPr>
           <w:p>
             <w:r>
-              <w:t>med</w:t>
+              <w:t>low</w:t>
+            </w:r>
+          </w:p>
+        </w:tc>
+        <w:tc>
+          <w:tcPr>
+            <w:tcW w:type="dxa" w:w="1080"/>
+          </w:tcPr>
+          <w:p>
+            <w:r>
+              <w:t>UND</w:t>
             </w:r>
           </w:p>
         </w:tc>
@@ -14625,17 +14654,7 @@
           </w:tcPr>
           <w:p>
             <w:r>
-              <w:t>LATER (2)</w:t>
-            </w:r>
-          </w:p>
-        </w:tc>
-        <w:tc>
-          <w:tcPr>
-            <w:tcW w:type="dxa" w:w="1080"/>
-          </w:tcPr>
-          <w:p>
-            <w:r>
-              <w:t>LATER (2)</w:t>
+              <w:t>UND</w:t>
             </w:r>
           </w:p>
         </w:tc>
@@ -15537,7 +15556,7 @@
           </w:tcPr>
           <w:p>
             <w:r>
-              <w:t>LATER (2)</w:t>
+              <w:t>UND</w:t>
             </w:r>
           </w:p>
         </w:tc>
@@ -16111,7 +16130,7 @@
           </w:tcPr>
           <w:p>
             <w:r>
-              <w:t>LATER (2)</w:t>
+              <w:t>UND</w:t>
             </w:r>
           </w:p>
         </w:tc>
@@ -16481,47 +16500,47 @@
           </w:tcPr>
           <w:p>
             <w:r>
-              <w:t>COUNTY_ONLY_PRECINCT_AT_CANVASS</w:t>
-            </w:r>
-          </w:p>
-        </w:tc>
-        <w:tc>
-          <w:tcPr>
-            <w:tcW w:type="dxa" w:w="1080"/>
-          </w:tcPr>
-          <w:p>
-            <w:r>
-              <w:t>med</w:t>
-            </w:r>
-          </w:p>
-        </w:tc>
-        <w:tc>
-          <w:tcPr>
-            <w:tcW w:type="dxa" w:w="1080"/>
-          </w:tcPr>
-          <w:p>
-            <w:r>
-              <w:t>LATER (2)</w:t>
-            </w:r>
-          </w:p>
-        </w:tc>
-        <w:tc>
-          <w:tcPr>
-            <w:tcW w:type="dxa" w:w="1080"/>
-          </w:tcPr>
-          <w:p>
-            <w:r>
-              <w:t>LATER (2)</w:t>
-            </w:r>
-          </w:p>
-        </w:tc>
-        <w:tc>
-          <w:tcPr>
-            <w:tcW w:type="dxa" w:w="1080"/>
-          </w:tcPr>
-          <w:p>
-            <w:r>
-              <w:t>LATER (2)</w:t>
+              <w:t>UNKNOWN</w:t>
+            </w:r>
+          </w:p>
+        </w:tc>
+        <w:tc>
+          <w:tcPr>
+            <w:tcW w:type="dxa" w:w="1080"/>
+          </w:tcPr>
+          <w:p>
+            <w:r>
+              <w:t>low</w:t>
+            </w:r>
+          </w:p>
+        </w:tc>
+        <w:tc>
+          <w:tcPr>
+            <w:tcW w:type="dxa" w:w="1080"/>
+          </w:tcPr>
+          <w:p>
+            <w:r>
+              <w:t>UND</w:t>
+            </w:r>
+          </w:p>
+        </w:tc>
+        <w:tc>
+          <w:tcPr>
+            <w:tcW w:type="dxa" w:w="1080"/>
+          </w:tcPr>
+          <w:p>
+            <w:r>
+              <w:t>UND</w:t>
+            </w:r>
+          </w:p>
+        </w:tc>
+        <w:tc>
+          <w:tcPr>
+            <w:tcW w:type="dxa" w:w="1080"/>
+          </w:tcPr>
+          <w:p>
+            <w:r>
+              <w:t>UND</w:t>
             </w:r>
           </w:p>
         </w:tc>
@@ -16921,7 +16940,7 @@
           </w:tcPr>
           <w:p>
             <w:r>
-              <w:t>LATER (2)</w:t>
+              <w:t>UND</w:t>
             </w:r>
           </w:p>
         </w:tc>
@@ -17065,7 +17084,17 @@
           </w:tcPr>
           <w:p>
             <w:r>
-              <w:t>med</w:t>
+              <w:t>low</w:t>
+            </w:r>
+          </w:p>
+        </w:tc>
+        <w:tc>
+          <w:tcPr>
+            <w:tcW w:type="dxa" w:w="1080"/>
+          </w:tcPr>
+          <w:p>
+            <w:r>
+              <w:t>UND</w:t>
             </w:r>
           </w:p>
         </w:tc>
@@ -17085,17 +17114,7 @@
           </w:tcPr>
           <w:p>
             <w:r>
-              <w:t>LATER (2)</w:t>
-            </w:r>
-          </w:p>
-        </w:tc>
-        <w:tc>
-          <w:tcPr>
-            <w:tcW w:type="dxa" w:w="1080"/>
-          </w:tcPr>
-          <w:p>
-            <w:r>
-              <w:t>LATER (2)</w:t>
+              <w:t>UND</w:t>
             </w:r>
           </w:p>
         </w:tc>
@@ -17547,17 +17566,17 @@
           </w:tcPr>
           <w:p>
             <w:r>
-              <w:t>PRECINCT_END_OF_NIGHT</w:t>
-            </w:r>
-          </w:p>
-        </w:tc>
-        <w:tc>
-          <w:tcPr>
-            <w:tcW w:type="dxa" w:w="1080"/>
-          </w:tcPr>
-          <w:p>
-            <w:r>
-              <w:t>high</w:t>
+              <w:t>UNKNOWN</w:t>
+            </w:r>
+          </w:p>
+        </w:tc>
+        <w:tc>
+          <w:tcPr>
+            <w:tcW w:type="dxa" w:w="1080"/>
+          </w:tcPr>
+          <w:p>
+            <w:r>
+              <w:t>low</w:t>
             </w:r>
           </w:p>
         </w:tc>
@@ -18203,17 +18222,17 @@
           </w:tcPr>
           <w:p>
             <w:r>
-              <w:t>COUNTY_ONLY_PRECINCT_AT_CANVASS</w:t>
-            </w:r>
-          </w:p>
-        </w:tc>
-        <w:tc>
-          <w:tcPr>
-            <w:tcW w:type="dxa" w:w="1080"/>
-          </w:tcPr>
-          <w:p>
-            <w:r>
-              <w:t>med</w:t>
+              <w:t>UNKNOWN</w:t>
+            </w:r>
+          </w:p>
+        </w:tc>
+        <w:tc>
+          <w:tcPr>
+            <w:tcW w:type="dxa" w:w="1080"/>
+          </w:tcPr>
+          <w:p>
+            <w:r>
+              <w:t>low</w:t>
             </w:r>
           </w:p>
         </w:tc>
@@ -18233,17 +18252,17 @@
           </w:tcPr>
           <w:p>
             <w:r>
-              <w:t>LATER (2)</w:t>
-            </w:r>
-          </w:p>
-        </w:tc>
-        <w:tc>
-          <w:tcPr>
-            <w:tcW w:type="dxa" w:w="1080"/>
-          </w:tcPr>
-          <w:p>
-            <w:r>
-              <w:t>LATER (2)</w:t>
+              <w:t>UND</w:t>
+            </w:r>
+          </w:p>
+        </w:tc>
+        <w:tc>
+          <w:tcPr>
+            <w:tcW w:type="dxa" w:w="1080"/>
+          </w:tcPr>
+          <w:p>
+            <w:r>
+              <w:t>UND</w:t>
             </w:r>
           </w:p>
         </w:tc>
@@ -18367,7 +18386,7 @@
           </w:tcPr>
           <w:p>
             <w:r>
-              <w:t>COUNTY_ONLY_PRECINCT_AT_CANVASS</w:t>
+              <w:t>UNKNOWN</w:t>
             </w:r>
           </w:p>
         </w:tc>
@@ -18407,7 +18426,7 @@
           </w:tcPr>
           <w:p>
             <w:r>
-              <w:t>LATER (2)</w:t>
+              <w:t>UND</w:t>
             </w:r>
           </w:p>
         </w:tc>
@@ -18571,7 +18590,7 @@
           </w:tcPr>
           <w:p>
             <w:r>
-              <w:t>LATER (2)</w:t>
+              <w:t>UND</w:t>
             </w:r>
           </w:p>
         </w:tc>
@@ -18869,27 +18888,27 @@
           </w:tcPr>
           <w:p>
             <w:r>
-              <w:t>med</w:t>
-            </w:r>
-          </w:p>
-        </w:tc>
-        <w:tc>
-          <w:tcPr>
-            <w:tcW w:type="dxa" w:w="1080"/>
-          </w:tcPr>
-          <w:p>
-            <w:r>
-              <w:t>LATER (2)</w:t>
-            </w:r>
-          </w:p>
-        </w:tc>
-        <w:tc>
-          <w:tcPr>
-            <w:tcW w:type="dxa" w:w="1080"/>
-          </w:tcPr>
-          <w:p>
-            <w:r>
-              <w:t>LATER (2)</w:t>
+              <w:t>low</w:t>
+            </w:r>
+          </w:p>
+        </w:tc>
+        <w:tc>
+          <w:tcPr>
+            <w:tcW w:type="dxa" w:w="1080"/>
+          </w:tcPr>
+          <w:p>
+            <w:r>
+              <w:t>UND</w:t>
+            </w:r>
+          </w:p>
+        </w:tc>
+        <w:tc>
+          <w:tcPr>
+            <w:tcW w:type="dxa" w:w="1080"/>
+          </w:tcPr>
+          <w:p>
+            <w:r>
+              <w:t>UND</w:t>
             </w:r>
           </w:p>
         </w:tc>
@@ -18961,7 +18980,7 @@
           </w:tcPr>
           <w:p>
             <w:r>
-              <w:t>LATER (2)</w:t>
+              <w:t>UND</w:t>
             </w:r>
           </w:p>
         </w:tc>
@@ -19515,7 +19534,7 @@
           </w:tcPr>
           <w:p>
             <w:r>
-              <w:t>COUNTY_ONLY_PRECINCT_AT_CANVASS</w:t>
+              <w:t>UNKNOWN</w:t>
             </w:r>
           </w:p>
         </w:tc>
@@ -19555,7 +19574,7 @@
           </w:tcPr>
           <w:p>
             <w:r>
-              <w:t>LATER (2)</w:t>
+              <w:t>UND</w:t>
             </w:r>
           </w:p>
         </w:tc>
@@ -19607,7 +19626,7 @@
           </w:tcPr>
           <w:p>
             <w:r>
-              <w:t>med</w:t>
+              <w:t>low</w:t>
             </w:r>
           </w:p>
         </w:tc>
@@ -19627,7 +19646,7 @@
           </w:tcPr>
           <w:p>
             <w:r>
-              <w:t>LATER (2)</w:t>
+              <w:t>UND</w:t>
             </w:r>
           </w:p>
         </w:tc>
@@ -19679,7 +19698,7 @@
           </w:tcPr>
           <w:p>
             <w:r>
-              <w:t>COUNTY_ONLY_PRECINCT_AT_CANVASS</w:t>
+              <w:t>UNKNOWN</w:t>
             </w:r>
           </w:p>
         </w:tc>

</xml_diff>

<commit_message>
Rebuild summary.docx and full_analysis.docx with targeted-pass tags (Nueces, Jefferson, Parker, Lubbock override, Montgomery)
Co-Authored-By: Claude Opus 5.5 <noreply@anthropic.com>
Claude-Session: https://claude.ai/code/session_01SDNZBG6oNndbYxCTBGxc63
</commit_message>
<xml_diff>
--- a/full_analysis.docx
+++ b/full_analysis.docx
@@ -13,7 +13,7 @@
     </w:p>
     <w:p>
       <w:r>
-        <w:t>Phase 1 results, method, verification, and per-county detail for all 254 counties. Generated 2026-10-02 17:00 UTC.</w:t>
+        <w:t>Phase 1 results, method, verification, and per-county detail for all 254 counties. Generated 2026-10-02 21:39 UTC.</w:t>
       </w:r>
     </w:p>
     <w:p>
@@ -441,6 +441,16 @@
           </w:tcPr>
           <w:p>
             <w:r>
+              <w:t>25</w:t>
+            </w:r>
+          </w:p>
+        </w:tc>
+        <w:tc>
+          <w:tcPr>
+            <w:tcW w:type="dxa" w:w="1728"/>
+          </w:tcPr>
+          <w:p>
+            <w:r>
               <w:t>21</w:t>
             </w:r>
           </w:p>
@@ -451,17 +461,7 @@
           </w:tcPr>
           <w:p>
             <w:r>
-              <w:t>18</w:t>
-            </w:r>
-          </w:p>
-        </w:tc>
-        <w:tc>
-          <w:tcPr>
-            <w:tcW w:type="dxa" w:w="1728"/>
-          </w:tcPr>
-          <w:p>
-            <w:r>
-              <w:t>1</w:t>
+              <w:t>2</w:t>
             </w:r>
           </w:p>
         </w:tc>
@@ -545,7 +545,7 @@
           </w:tcPr>
           <w:p>
             <w:r>
-              <w:t>105</w:t>
+              <w:t>106</w:t>
             </w:r>
           </w:p>
         </w:tc>
@@ -575,7 +575,7 @@
           </w:tcPr>
           <w:p>
             <w:r>
-              <w:t>47</w:t>
+              <w:t>48</w:t>
             </w:r>
           </w:p>
         </w:tc>
@@ -649,7 +649,7 @@
           </w:tcPr>
           <w:p>
             <w:r>
-              <w:t>106</w:t>
+              <w:t>101</w:t>
             </w:r>
           </w:p>
         </w:tc>
@@ -679,7 +679,7 @@
           </w:tcPr>
           <w:p>
             <w:r>
-              <w:t>106</w:t>
+              <w:t>101</w:t>
             </w:r>
           </w:p>
         </w:tc>
@@ -704,10 +704,10 @@
         <w:rPr>
           <w:b/>
         </w:rPr>
-        <w:t xml:space="preserve">LIVE_PRECINCT (21): </w:t>
+        <w:t xml:space="preserve">LIVE_PRECINCT (25): </w:t>
       </w:r>
       <w:r>
-        <w:t>Bell (low), Bexar (high), Comal (low), Dallas (high), Denton (high), El Paso (high), Fort Bend (high), Galveston (high), Harris (med), Hidalgo (high), Hunt (high), Kaufman (high), Kendall (high), Midland (high), Montague (high), Rockwall (high), Rusk (high), Tarrant (high), Travis (high), Victoria (high), Wood (high)</w:t>
+        <w:t>Bell (low), Bexar (high), Comal (low), Dallas (high), Denton (high), El Paso (high), Fort Bend (high), Galveston (high), Harris (med), Hidalgo (high), Hunt (high), Jefferson (high), Kaufman (high), Kendall (high), Lubbock (med), Midland (high), Montague (high), Nueces (high), Parker (high), Rockwall (high), Rusk (high), Tarrant (high), Travis (high), Victoria (high), Wood (high)</w:t>
       </w:r>
     </w:p>
     <w:p>
@@ -822,7 +822,7 @@
           </w:tcPr>
           <w:p>
             <w:r>
-              <w:t>21</w:t>
+              <w:t>25</w:t>
             </w:r>
           </w:p>
         </w:tc>
@@ -862,7 +862,7 @@
           </w:tcPr>
           <w:p>
             <w:r>
-              <w:t>168</w:t>
+              <w:t>164</w:t>
             </w:r>
           </w:p>
         </w:tc>
@@ -884,7 +884,7 @@
           </w:tcPr>
           <w:p>
             <w:r>
-              <w:t>22</w:t>
+              <w:t>24</w:t>
             </w:r>
           </w:p>
         </w:tc>
@@ -894,7 +894,7 @@
           </w:tcPr>
           <w:p>
             <w:r>
-              <w:t>14</w:t>
+              <w:t>15</w:t>
             </w:r>
           </w:p>
         </w:tc>
@@ -904,7 +904,7 @@
           </w:tcPr>
           <w:p>
             <w:r>
-              <w:t>64</w:t>
+              <w:t>65</w:t>
             </w:r>
           </w:p>
         </w:tc>
@@ -924,7 +924,7 @@
           </w:tcPr>
           <w:p>
             <w:r>
-              <w:t>154</w:t>
+              <w:t>150</w:t>
             </w:r>
           </w:p>
         </w:tc>
@@ -946,7 +946,7 @@
           </w:tcPr>
           <w:p>
             <w:r>
-              <w:t>13</w:t>
+              <w:t>14</w:t>
             </w:r>
           </w:p>
         </w:tc>
@@ -966,7 +966,7 @@
           </w:tcPr>
           <w:p>
             <w:r>
-              <w:t>82</w:t>
+              <w:t>84</w:t>
             </w:r>
           </w:p>
         </w:tc>
@@ -986,7 +986,7 @@
           </w:tcPr>
           <w:p>
             <w:r>
-              <w:t>135</w:t>
+              <w:t>132</w:t>
             </w:r>
           </w:p>
         </w:tc>
@@ -995,7 +995,7 @@
     <w:p/>
     <w:p>
       <w:r>
-        <w:t>Of 762 county-elections, 305 were determined: 72 by check 1 (vendor update log), 231 by check 2 (county-posted reports), and 2 by check 3 (Wayback captures). 457 remain UNDETERMINED.</w:t>
+        <w:t>Of 762 county-elections, 316 were determined: 82 by check 1 (vendor update log), 232 by check 2 (county-posted reports), and 2 by check 3 (Wayback captures). 446 remain UNDETERMINED.</w:t>
       </w:r>
     </w:p>
     <w:p>
@@ -1067,7 +1067,7 @@
           </w:tcPr>
           <w:p>
             <w:r>
-              <w:t>unknown</w:t>
+              <w:t>clarity_style</w:t>
             </w:r>
           </w:p>
         </w:tc>
@@ -1089,7 +1089,7 @@
           </w:tcPr>
           <w:p>
             <w:r>
-              <w:t>clarity_style</w:t>
+              <w:t>unknown</w:t>
             </w:r>
           </w:p>
         </w:tc>
@@ -1225,7 +1225,7 @@
     </w:p>
     <w:p>
       <w:r>
-        <w:t>119 counties were re-checked blind; 101 agreed with the research tag. Disagreements, set to UNKNOWN: Cherokee, Childress, Dimmit, Foard, Garza, Hamilton, Haskell, Irion, Jasper, Kent, Lamar, Robertson, San Saba, Scurry, Terrell, Throckmorton, Tyler, Zapata. Per-county detail is in phase1/verification/ and phase1/verification_log.md.</w:t>
+        <w:t>123 counties were re-checked blind; 105 agreed with the research tag. Disagreements, set to UNKNOWN: Cherokee, Childress, Dimmit, Foard, Garza, Hamilton, Haskell, Irion, Jasper, Kent, Lamar, Robertson, San Saba, Scurry, Terrell, Throckmorton, Tyler, Zapata. Per-county detail is in phase1/verification/ and phase1/verification_log.md.</w:t>
       </w:r>
     </w:p>
     <w:p>
@@ -1249,7 +1249,7 @@
         <w:pStyle w:val="ListBullet"/>
       </w:pPr>
       <w:r>
-        <w:t>106 counties are UNKNOWN. Most post election-night reports that are later overwritten, use web servers that do not report upload times, or block automated requests.</w:t>
+        <w:t>101 counties are UNKNOWN. Most post election-night reports that are later overwritten, use web servers that do not report upload times, or block automated requests.</w:t>
       </w:r>
     </w:p>
     <w:p>
@@ -1274,6 +1274,14 @@
       </w:pPr>
       <w:r>
         <w:t>Some counties hide precinct values in a particular election (Clarity marks them protected), so the same county can be LIVE in one election and LATER in another. The two-of-three rule decides the tag.</w:t>
+      </w:r>
+    </w:p>
+    <w:p>
+      <w:pPr>
+        <w:pStyle w:val="ListBullet"/>
+      </w:pPr>
+      <w:r>
+        <w:t>Owner overrides (tag set by the project owner where the fixed rule gives another tag; both are recorded): Lubbock (LIVE_PRECINCT; rule gives UNKNOWN).</w:t>
       </w:r>
     </w:p>
     <w:p>
@@ -11416,47 +11424,47 @@
           </w:tcPr>
           <w:p>
             <w:r>
-              <w:t>UNKNOWN</w:t>
-            </w:r>
-          </w:p>
-        </w:tc>
-        <w:tc>
-          <w:tcPr>
-            <w:tcW w:type="dxa" w:w="1080"/>
-          </w:tcPr>
-          <w:p>
-            <w:r>
-              <w:t>low</w:t>
-            </w:r>
-          </w:p>
-        </w:tc>
-        <w:tc>
-          <w:tcPr>
-            <w:tcW w:type="dxa" w:w="1080"/>
-          </w:tcPr>
-          <w:p>
-            <w:r>
-              <w:t>UND</w:t>
-            </w:r>
-          </w:p>
-        </w:tc>
-        <w:tc>
-          <w:tcPr>
-            <w:tcW w:type="dxa" w:w="1080"/>
-          </w:tcPr>
-          <w:p>
-            <w:r>
-              <w:t>UND</w:t>
-            </w:r>
-          </w:p>
-        </w:tc>
-        <w:tc>
-          <w:tcPr>
-            <w:tcW w:type="dxa" w:w="1080"/>
-          </w:tcPr>
-          <w:p>
-            <w:r>
-              <w:t>UND</w:t>
+              <w:t>LIVE_PRECINCT</w:t>
+            </w:r>
+          </w:p>
+        </w:tc>
+        <w:tc>
+          <w:tcPr>
+            <w:tcW w:type="dxa" w:w="1080"/>
+          </w:tcPr>
+          <w:p>
+            <w:r>
+              <w:t>high</w:t>
+            </w:r>
+          </w:p>
+        </w:tc>
+        <w:tc>
+          <w:tcPr>
+            <w:tcW w:type="dxa" w:w="1080"/>
+          </w:tcPr>
+          <w:p>
+            <w:r>
+              <w:t>LIVE (1)</w:t>
+            </w:r>
+          </w:p>
+        </w:tc>
+        <w:tc>
+          <w:tcPr>
+            <w:tcW w:type="dxa" w:w="1080"/>
+          </w:tcPr>
+          <w:p>
+            <w:r>
+              <w:t>LIVE (1)</w:t>
+            </w:r>
+          </w:p>
+        </w:tc>
+        <w:tc>
+          <w:tcPr>
+            <w:tcW w:type="dxa" w:w="1080"/>
+          </w:tcPr>
+          <w:p>
+            <w:r>
+              <w:t>LIVE (1)</w:t>
             </w:r>
           </w:p>
         </w:tc>
@@ -13794,57 +13802,57 @@
           </w:tcPr>
           <w:p>
             <w:r>
-              <w:t>UNKNOWN</w:t>
-            </w:r>
-          </w:p>
-        </w:tc>
-        <w:tc>
-          <w:tcPr>
-            <w:tcW w:type="dxa" w:w="1080"/>
-          </w:tcPr>
-          <w:p>
-            <w:r>
-              <w:t>low</w:t>
-            </w:r>
-          </w:p>
-        </w:tc>
-        <w:tc>
-          <w:tcPr>
-            <w:tcW w:type="dxa" w:w="1080"/>
-          </w:tcPr>
-          <w:p>
-            <w:r>
-              <w:t>UND</w:t>
-            </w:r>
-          </w:p>
-        </w:tc>
-        <w:tc>
-          <w:tcPr>
-            <w:tcW w:type="dxa" w:w="1080"/>
-          </w:tcPr>
-          <w:p>
-            <w:r>
-              <w:t>UND</w:t>
-            </w:r>
-          </w:p>
-        </w:tc>
-        <w:tc>
-          <w:tcPr>
-            <w:tcW w:type="dxa" w:w="1080"/>
-          </w:tcPr>
-          <w:p>
-            <w:r>
-              <w:t>UND</w:t>
-            </w:r>
-          </w:p>
-        </w:tc>
-        <w:tc>
-          <w:tcPr>
-            <w:tcW w:type="dxa" w:w="1080"/>
-          </w:tcPr>
-          <w:p>
-            <w:r>
-              <w:t>unknown</w:t>
+              <w:t>LIVE_PRECINCT</w:t>
+            </w:r>
+          </w:p>
+        </w:tc>
+        <w:tc>
+          <w:tcPr>
+            <w:tcW w:type="dxa" w:w="1080"/>
+          </w:tcPr>
+          <w:p>
+            <w:r>
+              <w:t>med</w:t>
+            </w:r>
+          </w:p>
+        </w:tc>
+        <w:tc>
+          <w:tcPr>
+            <w:tcW w:type="dxa" w:w="1080"/>
+          </w:tcPr>
+          <w:p>
+            <w:r>
+              <w:t>LIVE (1)</w:t>
+            </w:r>
+          </w:p>
+        </w:tc>
+        <w:tc>
+          <w:tcPr>
+            <w:tcW w:type="dxa" w:w="1080"/>
+          </w:tcPr>
+          <w:p>
+            <w:r>
+              <w:t>END (1)</w:t>
+            </w:r>
+          </w:p>
+        </w:tc>
+        <w:tc>
+          <w:tcPr>
+            <w:tcW w:type="dxa" w:w="1080"/>
+          </w:tcPr>
+          <w:p>
+            <w:r>
+              <w:t>LATER (1)</w:t>
+            </w:r>
+          </w:p>
+        </w:tc>
+        <w:tc>
+          <w:tcPr>
+            <w:tcW w:type="dxa" w:w="1080"/>
+          </w:tcPr>
+          <w:p>
+            <w:r>
+              <w:t>clarity_style</w:t>
             </w:r>
           </w:p>
         </w:tc>
@@ -15270,7 +15278,7 @@
           </w:tcPr>
           <w:p>
             <w:r>
-              <w:t>UNKNOWN</w:t>
+              <w:t>COUNTY_ONLY_PRECINCT_AT_CANVASS</w:t>
             </w:r>
           </w:p>
         </w:tc>
@@ -15300,7 +15308,7 @@
           </w:tcPr>
           <w:p>
             <w:r>
-              <w:t>UND</w:t>
+              <w:t>LATER (2)</w:t>
             </w:r>
           </w:p>
         </w:tc>
@@ -15926,57 +15934,57 @@
           </w:tcPr>
           <w:p>
             <w:r>
-              <w:t>UNKNOWN</w:t>
-            </w:r>
-          </w:p>
-        </w:tc>
-        <w:tc>
-          <w:tcPr>
-            <w:tcW w:type="dxa" w:w="1080"/>
-          </w:tcPr>
-          <w:p>
-            <w:r>
-              <w:t>low</w:t>
-            </w:r>
-          </w:p>
-        </w:tc>
-        <w:tc>
-          <w:tcPr>
-            <w:tcW w:type="dxa" w:w="1080"/>
-          </w:tcPr>
-          <w:p>
-            <w:r>
-              <w:t>UND</w:t>
-            </w:r>
-          </w:p>
-        </w:tc>
-        <w:tc>
-          <w:tcPr>
-            <w:tcW w:type="dxa" w:w="1080"/>
-          </w:tcPr>
-          <w:p>
-            <w:r>
-              <w:t>UND</w:t>
-            </w:r>
-          </w:p>
-        </w:tc>
-        <w:tc>
-          <w:tcPr>
-            <w:tcW w:type="dxa" w:w="1080"/>
-          </w:tcPr>
-          <w:p>
-            <w:r>
-              <w:t>UND</w:t>
-            </w:r>
-          </w:p>
-        </w:tc>
-        <w:tc>
-          <w:tcPr>
-            <w:tcW w:type="dxa" w:w="1080"/>
-          </w:tcPr>
-          <w:p>
-            <w:r>
-              <w:t>unknown</w:t>
+              <w:t>LIVE_PRECINCT</w:t>
+            </w:r>
+          </w:p>
+        </w:tc>
+        <w:tc>
+          <w:tcPr>
+            <w:tcW w:type="dxa" w:w="1080"/>
+          </w:tcPr>
+          <w:p>
+            <w:r>
+              <w:t>high</w:t>
+            </w:r>
+          </w:p>
+        </w:tc>
+        <w:tc>
+          <w:tcPr>
+            <w:tcW w:type="dxa" w:w="1080"/>
+          </w:tcPr>
+          <w:p>
+            <w:r>
+              <w:t>LIVE (1)</w:t>
+            </w:r>
+          </w:p>
+        </w:tc>
+        <w:tc>
+          <w:tcPr>
+            <w:tcW w:type="dxa" w:w="1080"/>
+          </w:tcPr>
+          <w:p>
+            <w:r>
+              <w:t>LIVE (1)</w:t>
+            </w:r>
+          </w:p>
+        </w:tc>
+        <w:tc>
+          <w:tcPr>
+            <w:tcW w:type="dxa" w:w="1080"/>
+          </w:tcPr>
+          <w:p>
+            <w:r>
+              <w:t>LATER (1)</w:t>
+            </w:r>
+          </w:p>
+        </w:tc>
+        <w:tc>
+          <w:tcPr>
+            <w:tcW w:type="dxa" w:w="1080"/>
+          </w:tcPr>
+          <w:p>
+            <w:r>
+              <w:t>clarity_style</w:t>
             </w:r>
           </w:p>
         </w:tc>
@@ -16418,27 +16426,27 @@
           </w:tcPr>
           <w:p>
             <w:r>
-              <w:t>UNKNOWN</w:t>
-            </w:r>
-          </w:p>
-        </w:tc>
-        <w:tc>
-          <w:tcPr>
-            <w:tcW w:type="dxa" w:w="1080"/>
-          </w:tcPr>
-          <w:p>
-            <w:r>
-              <w:t>low</w:t>
-            </w:r>
-          </w:p>
-        </w:tc>
-        <w:tc>
-          <w:tcPr>
-            <w:tcW w:type="dxa" w:w="1080"/>
-          </w:tcPr>
-          <w:p>
-            <w:r>
-              <w:t>UND</w:t>
+              <w:t>LIVE_PRECINCT</w:t>
+            </w:r>
+          </w:p>
+        </w:tc>
+        <w:tc>
+          <w:tcPr>
+            <w:tcW w:type="dxa" w:w="1080"/>
+          </w:tcPr>
+          <w:p>
+            <w:r>
+              <w:t>high</w:t>
+            </w:r>
+          </w:p>
+        </w:tc>
+        <w:tc>
+          <w:tcPr>
+            <w:tcW w:type="dxa" w:w="1080"/>
+          </w:tcPr>
+          <w:p>
+            <w:r>
+              <w:t>LIVE (1)</w:t>
             </w:r>
           </w:p>
         </w:tc>

</xml_diff>

<commit_message>
Collin verified (verifier-8 agrees, PRECINCT_END_OF_NIGHT low); 2024 check label 2; stale notes fixed; rebuild deliverables
Co-Authored-By: Claude Opus 5.5 <noreply@anthropic.com>
Claude-Session: https://claude.ai/code/session_01SDNZBG6oNndbYxCTBGxc63
</commit_message>
<xml_diff>
--- a/full_analysis.docx
+++ b/full_analysis.docx
@@ -13,7 +13,7 @@
     </w:p>
     <w:p>
       <w:r>
-        <w:t>Phase 1 results, method, verification, and per-county detail for all 254 counties. Generated 2026-10-02 21:39 UTC.</w:t>
+        <w:t>Phase 1 results, method, verification, and per-county detail for all 254 counties. Generated 2026-10-02 21:53 UTC.</w:t>
       </w:r>
     </w:p>
     <w:p>
@@ -493,7 +493,7 @@
           </w:tcPr>
           <w:p>
             <w:r>
-              <w:t>21</w:t>
+              <w:t>22</w:t>
             </w:r>
           </w:p>
         </w:tc>
@@ -523,7 +523,7 @@
           </w:tcPr>
           <w:p>
             <w:r>
-              <w:t>10</w:t>
+              <w:t>11</w:t>
             </w:r>
           </w:p>
         </w:tc>
@@ -649,7 +649,7 @@
           </w:tcPr>
           <w:p>
             <w:r>
-              <w:t>101</w:t>
+              <w:t>100</w:t>
             </w:r>
           </w:p>
         </w:tc>
@@ -679,7 +679,7 @@
           </w:tcPr>
           <w:p>
             <w:r>
-              <w:t>101</w:t>
+              <w:t>100</w:t>
             </w:r>
           </w:p>
         </w:tc>
@@ -715,10 +715,10 @@
         <w:rPr>
           <w:b/>
         </w:rPr>
-        <w:t xml:space="preserve">PRECINCT_END_OF_NIGHT (21): </w:t>
+        <w:t xml:space="preserve">PRECINCT_END_OF_NIGHT (22): </w:t>
       </w:r>
       <w:r>
-        <w:t>Bandera (low), Bastrop (high), Bowie (low), Burnet (low), Chambers (med), Cochran (med), Cooke (med), DeWitt (low), Donley (low), Fayette (med), Gillespie (low), Glasscock (low), Gregg (high), Hemphill (med), Hopkins (low), Houston (med), Jim Hogg (low), Liberty (med), Lipscomb (med), Lynn (med), Ochiltree (low)</w:t>
+        <w:t>Bandera (low), Bastrop (high), Bowie (low), Burnet (low), Chambers (med), Cochran (med), Collin (low), Cooke (med), DeWitt (low), Donley (low), Fayette (med), Gillespie (low), Glasscock (low), Gregg (high), Hemphill (med), Hopkins (low), Houston (med), Jim Hogg (low), Liberty (med), Lipscomb (med), Lynn (med), Ochiltree (low)</w:t>
       </w:r>
     </w:p>
     <w:p>
@@ -832,7 +832,7 @@
           </w:tcPr>
           <w:p>
             <w:r>
-              <w:t>10</w:t>
+              <w:t>11</w:t>
             </w:r>
           </w:p>
         </w:tc>
@@ -862,7 +862,7 @@
           </w:tcPr>
           <w:p>
             <w:r>
-              <w:t>164</w:t>
+              <w:t>163</w:t>
             </w:r>
           </w:p>
         </w:tc>
@@ -995,7 +995,7 @@
     <w:p/>
     <w:p>
       <w:r>
-        <w:t>Of 762 county-elections, 316 were determined: 82 by check 1 (vendor update log), 232 by check 2 (county-posted reports), and 2 by check 3 (Wayback captures). 446 remain UNDETERMINED.</w:t>
+        <w:t>Of 762 county-elections, 317 were determined: 82 by check 1 (vendor update log), 233 by check 2 (county-posted reports), and 2 by check 3 (Wayback captures). 445 remain UNDETERMINED.</w:t>
       </w:r>
     </w:p>
     <w:p>
@@ -1055,7 +1055,7 @@
           </w:tcPr>
           <w:p>
             <w:r>
-              <w:t>188</w:t>
+              <w:t>189</w:t>
             </w:r>
           </w:p>
         </w:tc>
@@ -1121,7 +1121,7 @@
           </w:tcPr>
           <w:p>
             <w:r>
-              <w:t>4</w:t>
+              <w:t>3</w:t>
             </w:r>
           </w:p>
         </w:tc>
@@ -1225,7 +1225,7 @@
     </w:p>
     <w:p>
       <w:r>
-        <w:t>123 counties were re-checked blind; 105 agreed with the research tag. Disagreements, set to UNKNOWN: Cherokee, Childress, Dimmit, Foard, Garza, Hamilton, Haskell, Irion, Jasper, Kent, Lamar, Robertson, San Saba, Scurry, Terrell, Throckmorton, Tyler, Zapata. Per-county detail is in phase1/verification/ and phase1/verification_log.md.</w:t>
+        <w:t>124 counties were re-checked blind; 105 agreed with the research tag. Disagreements, set to UNKNOWN: Cherokee, Childress, Dimmit, Foard, Garza, Hamilton, Haskell, Irion, Jasper, Kent, Lamar, Robertson, San Saba, Scurry, Terrell, Throckmorton, Tyler, Zapata. Per-county detail is in phase1/verification/ and phase1/verification_log.md.</w:t>
       </w:r>
     </w:p>
     <w:p>
@@ -1249,7 +1249,7 @@
         <w:pStyle w:val="ListBullet"/>
       </w:pPr>
       <w:r>
-        <w:t>101 counties are UNKNOWN. Most post election-night reports that are later overwritten, use web servers that do not report upload times, or block automated requests.</w:t>
+        <w:t>100 counties are UNKNOWN. Most post election-night reports that are later overwritten, use web servers that do not report upload times, or block automated requests.</w:t>
       </w:r>
     </w:p>
     <w:p>
@@ -4864,7 +4864,7 @@
           </w:tcPr>
           <w:p>
             <w:r>
-              <w:t>UNKNOWN</w:t>
+              <w:t>PRECINCT_END_OF_NIGHT</w:t>
             </w:r>
           </w:p>
         </w:tc>
@@ -4884,6 +4884,16 @@
           </w:tcPr>
           <w:p>
             <w:r>
+              <w:t>END (2)</w:t>
+            </w:r>
+          </w:p>
+        </w:tc>
+        <w:tc>
+          <w:tcPr>
+            <w:tcW w:type="dxa" w:w="1080"/>
+          </w:tcPr>
+          <w:p>
+            <w:r>
               <w:t>UND</w:t>
             </w:r>
           </w:p>
@@ -4904,17 +4914,7 @@
           </w:tcPr>
           <w:p>
             <w:r>
-              <w:t>UND</w:t>
-            </w:r>
-          </w:p>
-        </w:tc>
-        <w:tc>
-          <w:tcPr>
-            <w:tcW w:type="dxa" w:w="1080"/>
-          </w:tcPr>
-          <w:p>
-            <w:r>
-              <w:t>homegrown</w:t>
+              <w:t>county_pdfs</w:t>
             </w:r>
           </w:p>
         </w:tc>

</xml_diff>

<commit_message>
Rebuild counties.csv and docs with verified targeted pass 3 changes
Co-Authored-By: Claude Opus 5.5 <noreply@anthropic.com>
Claude-Session: https://claude.ai/code/session_01SDNZBG6oNndbYxCTBGxc63
</commit_message>
<xml_diff>
--- a/full_analysis.docx
+++ b/full_analysis.docx
@@ -13,7 +13,7 @@
     </w:p>
     <w:p>
       <w:r>
-        <w:t>Phase 1 results, method, verification, and per-county detail for all 254 counties. Generated 2026-10-02 21:53 UTC.</w:t>
+        <w:t>Phase 1 results, method, verification, and per-county detail for all 254 counties. Generated 2026-10-02 22:36 UTC.</w:t>
       </w:r>
     </w:p>
     <w:p>
@@ -441,7 +441,7 @@
           </w:tcPr>
           <w:p>
             <w:r>
-              <w:t>25</w:t>
+              <w:t>26</w:t>
             </w:r>
           </w:p>
         </w:tc>
@@ -471,7 +471,7 @@
           </w:tcPr>
           <w:p>
             <w:r>
-              <w:t>2</w:t>
+              <w:t>3</w:t>
             </w:r>
           </w:p>
         </w:tc>
@@ -493,7 +493,7 @@
           </w:tcPr>
           <w:p>
             <w:r>
-              <w:t>22</w:t>
+              <w:t>24</w:t>
             </w:r>
           </w:p>
         </w:tc>
@@ -513,7 +513,7 @@
           </w:tcPr>
           <w:p>
             <w:r>
-              <w:t>9</w:t>
+              <w:t>11</w:t>
             </w:r>
           </w:p>
         </w:tc>
@@ -545,7 +545,7 @@
           </w:tcPr>
           <w:p>
             <w:r>
-              <w:t>106</w:t>
+              <w:t>111</w:t>
             </w:r>
           </w:p>
         </w:tc>
@@ -565,7 +565,7 @@
           </w:tcPr>
           <w:p>
             <w:r>
-              <w:t>57</w:t>
+              <w:t>58</w:t>
             </w:r>
           </w:p>
         </w:tc>
@@ -575,7 +575,7 @@
           </w:tcPr>
           <w:p>
             <w:r>
-              <w:t>48</w:t>
+              <w:t>52</w:t>
             </w:r>
           </w:p>
         </w:tc>
@@ -649,7 +649,7 @@
           </w:tcPr>
           <w:p>
             <w:r>
-              <w:t>100</w:t>
+              <w:t>92</w:t>
             </w:r>
           </w:p>
         </w:tc>
@@ -679,7 +679,7 @@
           </w:tcPr>
           <w:p>
             <w:r>
-              <w:t>100</w:t>
+              <w:t>92</w:t>
             </w:r>
           </w:p>
         </w:tc>
@@ -704,10 +704,10 @@
         <w:rPr>
           <w:b/>
         </w:rPr>
-        <w:t xml:space="preserve">LIVE_PRECINCT (25): </w:t>
+        <w:t xml:space="preserve">LIVE_PRECINCT (26): </w:t>
       </w:r>
       <w:r>
-        <w:t>Bell (low), Bexar (high), Comal (low), Dallas (high), Denton (high), El Paso (high), Fort Bend (high), Galveston (high), Harris (med), Hidalgo (high), Hunt (high), Jefferson (high), Kaufman (high), Kendall (high), Lubbock (med), Midland (high), Montague (high), Nueces (high), Parker (high), Rockwall (high), Rusk (high), Tarrant (high), Travis (high), Victoria (high), Wood (high)</w:t>
+        <w:t>Bell (low), Bexar (high), Comal (low), Dallas (high), Denton (high), El Paso (high), Fort Bend (high), Galveston (high), Harris (med), Hidalgo (high), Hunt (high), Jefferson (high), Kaufman (high), Kendall (high), Lubbock (med), Midland (high), Montague (high), Nueces (high), Parker (high), Rockwall (high), Rusk (high), Tarrant (high), Travis (high), Victoria (high), Williamson (low), Wood (high)</w:t>
       </w:r>
     </w:p>
     <w:p>
@@ -715,10 +715,10 @@
         <w:rPr>
           <w:b/>
         </w:rPr>
-        <w:t xml:space="preserve">PRECINCT_END_OF_NIGHT (22): </w:t>
+        <w:t xml:space="preserve">PRECINCT_END_OF_NIGHT (24): </w:t>
       </w:r>
       <w:r>
-        <w:t>Bandera (low), Bastrop (high), Bowie (low), Burnet (low), Chambers (med), Cochran (med), Collin (low), Cooke (med), DeWitt (low), Donley (low), Fayette (med), Gillespie (low), Glasscock (low), Gregg (high), Hemphill (med), Hopkins (low), Houston (med), Jim Hogg (low), Liberty (med), Lipscomb (med), Lynn (med), Ochiltree (low)</w:t>
+        <w:t>Bandera (low), Bastrop (high), Bowie (low), Burnet (low), Chambers (med), Cochran (med), Collin (low), Cooke (med), Coryell (med), DeWitt (low), Donley (low), Fayette (med), Gillespie (low), Glasscock (low), Gregg (high), Hemphill (med), Hopkins (low), Houston (med), Jim Hogg (low), Liberty (med), Lipscomb (med), Lynn (med), Ochiltree (low), Polk (med)</w:t>
       </w:r>
     </w:p>
     <w:p>
@@ -832,7 +832,7 @@
           </w:tcPr>
           <w:p>
             <w:r>
-              <w:t>11</w:t>
+              <w:t>12</w:t>
             </w:r>
           </w:p>
         </w:tc>
@@ -842,7 +842,7 @@
           </w:tcPr>
           <w:p>
             <w:r>
-              <w:t>54</w:t>
+              <w:t>56</w:t>
             </w:r>
           </w:p>
         </w:tc>
@@ -862,7 +862,7 @@
           </w:tcPr>
           <w:p>
             <w:r>
-              <w:t>163</w:t>
+              <w:t>160</w:t>
             </w:r>
           </w:p>
         </w:tc>
@@ -884,7 +884,7 @@
           </w:tcPr>
           <w:p>
             <w:r>
-              <w:t>24</w:t>
+              <w:t>25</w:t>
             </w:r>
           </w:p>
         </w:tc>
@@ -894,7 +894,7 @@
           </w:tcPr>
           <w:p>
             <w:r>
-              <w:t>15</w:t>
+              <w:t>17</w:t>
             </w:r>
           </w:p>
         </w:tc>
@@ -904,7 +904,7 @@
           </w:tcPr>
           <w:p>
             <w:r>
-              <w:t>65</w:t>
+              <w:t>69</w:t>
             </w:r>
           </w:p>
         </w:tc>
@@ -924,7 +924,7 @@
           </w:tcPr>
           <w:p>
             <w:r>
-              <w:t>150</w:t>
+              <w:t>143</w:t>
             </w:r>
           </w:p>
         </w:tc>
@@ -956,7 +956,7 @@
           </w:tcPr>
           <w:p>
             <w:r>
-              <w:t>24</w:t>
+              <w:t>26</w:t>
             </w:r>
           </w:p>
         </w:tc>
@@ -966,7 +966,7 @@
           </w:tcPr>
           <w:p>
             <w:r>
-              <w:t>84</w:t>
+              <w:t>85</w:t>
             </w:r>
           </w:p>
         </w:tc>
@@ -986,7 +986,7 @@
           </w:tcPr>
           <w:p>
             <w:r>
-              <w:t>132</w:t>
+              <w:t>129</w:t>
             </w:r>
           </w:p>
         </w:tc>
@@ -995,7 +995,7 @@
     <w:p/>
     <w:p>
       <w:r>
-        <w:t>Of 762 county-elections, 317 were determined: 82 by check 1 (vendor update log), 233 by check 2 (county-posted reports), and 2 by check 3 (Wayback captures). 445 remain UNDETERMINED.</w:t>
+        <w:t>Of 762 county-elections, 330 were determined: 82 by check 1 (vendor update log), 244 by check 2 (county-posted reports), and 4 by check 3 (Wayback captures). 432 remain UNDETERMINED.</w:t>
       </w:r>
     </w:p>
     <w:p>
@@ -1055,7 +1055,7 @@
           </w:tcPr>
           <w:p>
             <w:r>
-              <w:t>189</w:t>
+              <w:t>192</w:t>
             </w:r>
           </w:p>
         </w:tc>
@@ -1099,7 +1099,7 @@
           </w:tcPr>
           <w:p>
             <w:r>
-              <w:t>28</w:t>
+              <w:t>25</w:t>
             </w:r>
           </w:p>
         </w:tc>
@@ -1225,7 +1225,7 @@
     </w:p>
     <w:p>
       <w:r>
-        <w:t>124 counties were re-checked blind; 105 agreed with the research tag. Disagreements, set to UNKNOWN: Cherokee, Childress, Dimmit, Foard, Garza, Hamilton, Haskell, Irion, Jasper, Kent, Lamar, Robertson, San Saba, Scurry, Terrell, Throckmorton, Tyler, Zapata. Per-county detail is in phase1/verification/ and phase1/verification_log.md.</w:t>
+        <w:t>132 counties were re-checked blind; 112 agreed with the research tag. Disagreements, set to UNKNOWN: Cherokee, Childress, Dimmit, Foard, Garza, Hamilton, Haskell, Irion, Jasper, Kent, Lamar, Robertson, San Saba, Scurry, Terrell, Throckmorton, Tyler, Zapata. Per-county detail is in phase1/verification/ and phase1/verification_log.md.</w:t>
       </w:r>
     </w:p>
     <w:p>
@@ -1249,7 +1249,7 @@
         <w:pStyle w:val="ListBullet"/>
       </w:pPr>
       <w:r>
-        <w:t>100 counties are UNKNOWN. Most post election-night reports that are later overwritten, use web servers that do not report upload times, or block automated requests.</w:t>
+        <w:t>92 counties are UNKNOWN. Most post election-night reports that are later overwritten, use web servers that do not report upload times, or block automated requests.</w:t>
       </w:r>
     </w:p>
     <w:p>
@@ -5438,47 +5438,47 @@
           </w:tcPr>
           <w:p>
             <w:r>
-              <w:t>UNKNOWN</w:t>
-            </w:r>
-          </w:p>
-        </w:tc>
-        <w:tc>
-          <w:tcPr>
-            <w:tcW w:type="dxa" w:w="1080"/>
-          </w:tcPr>
-          <w:p>
-            <w:r>
-              <w:t>low</w:t>
-            </w:r>
-          </w:p>
-        </w:tc>
-        <w:tc>
-          <w:tcPr>
-            <w:tcW w:type="dxa" w:w="1080"/>
-          </w:tcPr>
-          <w:p>
-            <w:r>
-              <w:t>UND</w:t>
-            </w:r>
-          </w:p>
-        </w:tc>
-        <w:tc>
-          <w:tcPr>
-            <w:tcW w:type="dxa" w:w="1080"/>
-          </w:tcPr>
-          <w:p>
-            <w:r>
-              <w:t>UND</w:t>
-            </w:r>
-          </w:p>
-        </w:tc>
-        <w:tc>
-          <w:tcPr>
-            <w:tcW w:type="dxa" w:w="1080"/>
-          </w:tcPr>
-          <w:p>
-            <w:r>
-              <w:t>UND</w:t>
+              <w:t>PRECINCT_END_OF_NIGHT</w:t>
+            </w:r>
+          </w:p>
+        </w:tc>
+        <w:tc>
+          <w:tcPr>
+            <w:tcW w:type="dxa" w:w="1080"/>
+          </w:tcPr>
+          <w:p>
+            <w:r>
+              <w:t>med</w:t>
+            </w:r>
+          </w:p>
+        </w:tc>
+        <w:tc>
+          <w:tcPr>
+            <w:tcW w:type="dxa" w:w="1080"/>
+          </w:tcPr>
+          <w:p>
+            <w:r>
+              <w:t>END (2)</w:t>
+            </w:r>
+          </w:p>
+        </w:tc>
+        <w:tc>
+          <w:tcPr>
+            <w:tcW w:type="dxa" w:w="1080"/>
+          </w:tcPr>
+          <w:p>
+            <w:r>
+              <w:t>END (2)</w:t>
+            </w:r>
+          </w:p>
+        </w:tc>
+        <w:tc>
+          <w:tcPr>
+            <w:tcW w:type="dxa" w:w="1080"/>
+          </w:tcPr>
+          <w:p>
+            <w:r>
+              <w:t>END (2)</w:t>
             </w:r>
           </w:p>
         </w:tc>
@@ -9702,7 +9702,7 @@
           </w:tcPr>
           <w:p>
             <w:r>
-              <w:t>UNKNOWN</w:t>
+              <w:t>COUNTY_ONLY_PRECINCT_AT_CANVASS</w:t>
             </w:r>
           </w:p>
         </w:tc>
@@ -9732,7 +9732,7 @@
           </w:tcPr>
           <w:p>
             <w:r>
-              <w:t>UND</w:t>
+              <w:t>LATER (2)</w:t>
             </w:r>
           </w:p>
         </w:tc>
@@ -16590,17 +16590,17 @@
           </w:tcPr>
           <w:p>
             <w:r>
-              <w:t>UNKNOWN</w:t>
-            </w:r>
-          </w:p>
-        </w:tc>
-        <w:tc>
-          <w:tcPr>
-            <w:tcW w:type="dxa" w:w="1080"/>
-          </w:tcPr>
-          <w:p>
-            <w:r>
-              <w:t>low</w:t>
+              <w:t>COUNTY_ONLY_PRECINCT_AT_CANVASS</w:t>
+            </w:r>
+          </w:p>
+        </w:tc>
+        <w:tc>
+          <w:tcPr>
+            <w:tcW w:type="dxa" w:w="1080"/>
+          </w:tcPr>
+          <w:p>
+            <w:r>
+              <w:t>med</w:t>
             </w:r>
           </w:p>
         </w:tc>
@@ -16620,17 +16620,17 @@
           </w:tcPr>
           <w:p>
             <w:r>
-              <w:t>UND</w:t>
-            </w:r>
-          </w:p>
-        </w:tc>
-        <w:tc>
-          <w:tcPr>
-            <w:tcW w:type="dxa" w:w="1080"/>
-          </w:tcPr>
-          <w:p>
-            <w:r>
-              <w:t>UND</w:t>
+              <w:t>LATER (2)</w:t>
+            </w:r>
+          </w:p>
+        </w:tc>
+        <w:tc>
+          <w:tcPr>
+            <w:tcW w:type="dxa" w:w="1080"/>
+          </w:tcPr>
+          <w:p>
+            <w:r>
+              <w:t>LATER (2)</w:t>
             </w:r>
           </w:p>
         </w:tc>
@@ -16672,47 +16672,47 @@
           </w:tcPr>
           <w:p>
             <w:r>
-              <w:t>UNKNOWN</w:t>
-            </w:r>
-          </w:p>
-        </w:tc>
-        <w:tc>
-          <w:tcPr>
-            <w:tcW w:type="dxa" w:w="1080"/>
-          </w:tcPr>
-          <w:p>
-            <w:r>
-              <w:t>low</w:t>
-            </w:r>
-          </w:p>
-        </w:tc>
-        <w:tc>
-          <w:tcPr>
-            <w:tcW w:type="dxa" w:w="1080"/>
-          </w:tcPr>
-          <w:p>
-            <w:r>
-              <w:t>UND</w:t>
-            </w:r>
-          </w:p>
-        </w:tc>
-        <w:tc>
-          <w:tcPr>
-            <w:tcW w:type="dxa" w:w="1080"/>
-          </w:tcPr>
-          <w:p>
-            <w:r>
-              <w:t>UND</w:t>
-            </w:r>
-          </w:p>
-        </w:tc>
-        <w:tc>
-          <w:tcPr>
-            <w:tcW w:type="dxa" w:w="1080"/>
-          </w:tcPr>
-          <w:p>
-            <w:r>
-              <w:t>UND</w:t>
+              <w:t>PRECINCT_END_OF_NIGHT</w:t>
+            </w:r>
+          </w:p>
+        </w:tc>
+        <w:tc>
+          <w:tcPr>
+            <w:tcW w:type="dxa" w:w="1080"/>
+          </w:tcPr>
+          <w:p>
+            <w:r>
+              <w:t>med</w:t>
+            </w:r>
+          </w:p>
+        </w:tc>
+        <w:tc>
+          <w:tcPr>
+            <w:tcW w:type="dxa" w:w="1080"/>
+          </w:tcPr>
+          <w:p>
+            <w:r>
+              <w:t>LATER (2)</w:t>
+            </w:r>
+          </w:p>
+        </w:tc>
+        <w:tc>
+          <w:tcPr>
+            <w:tcW w:type="dxa" w:w="1080"/>
+          </w:tcPr>
+          <w:p>
+            <w:r>
+              <w:t>END (2)</w:t>
+            </w:r>
+          </w:p>
+        </w:tc>
+        <w:tc>
+          <w:tcPr>
+            <w:tcW w:type="dxa" w:w="1080"/>
+          </w:tcPr>
+          <w:p>
+            <w:r>
+              <w:t>END (2)</w:t>
             </w:r>
           </w:p>
         </w:tc>
@@ -17050,7 +17050,7 @@
           </w:tcPr>
           <w:p>
             <w:r>
-              <w:t>unknown</w:t>
+              <w:t>county_pdfs</w:t>
             </w:r>
           </w:p>
         </w:tc>
@@ -19460,7 +19460,7 @@
           </w:tcPr>
           <w:p>
             <w:r>
-              <w:t>UNKNOWN</w:t>
+              <w:t>COUNTY_ONLY_PRECINCT_AT_CANVASS</w:t>
             </w:r>
           </w:p>
         </w:tc>
@@ -19490,6 +19490,16 @@
           </w:tcPr>
           <w:p>
             <w:r>
+              <w:t>LATER (2)</w:t>
+            </w:r>
+          </w:p>
+        </w:tc>
+        <w:tc>
+          <w:tcPr>
+            <w:tcW w:type="dxa" w:w="1080"/>
+          </w:tcPr>
+          <w:p>
+            <w:r>
               <w:t>UND</w:t>
             </w:r>
           </w:p>
@@ -19500,17 +19510,7 @@
           </w:tcPr>
           <w:p>
             <w:r>
-              <w:t>UND</w:t>
-            </w:r>
-          </w:p>
-        </w:tc>
-        <w:tc>
-          <w:tcPr>
-            <w:tcW w:type="dxa" w:w="1080"/>
-          </w:tcPr>
-          <w:p>
-            <w:r>
-              <w:t>unknown</w:t>
+              <w:t>county_pdfs</w:t>
             </w:r>
           </w:p>
         </w:tc>
@@ -20526,7 +20526,7 @@
           </w:tcPr>
           <w:p>
             <w:r>
-              <w:t>UNKNOWN</w:t>
+              <w:t>COUNTY_ONLY_PRECINCT_AT_CANVASS</w:t>
             </w:r>
           </w:p>
         </w:tc>
@@ -20556,6 +20556,16 @@
           </w:tcPr>
           <w:p>
             <w:r>
+              <w:t>LATER (2)</w:t>
+            </w:r>
+          </w:p>
+        </w:tc>
+        <w:tc>
+          <w:tcPr>
+            <w:tcW w:type="dxa" w:w="1080"/>
+          </w:tcPr>
+          <w:p>
+            <w:r>
               <w:t>UND</w:t>
             </w:r>
           </w:p>
@@ -20566,17 +20576,7 @@
           </w:tcPr>
           <w:p>
             <w:r>
-              <w:t>UND</w:t>
-            </w:r>
-          </w:p>
-        </w:tc>
-        <w:tc>
-          <w:tcPr>
-            <w:tcW w:type="dxa" w:w="1080"/>
-          </w:tcPr>
-          <w:p>
-            <w:r>
-              <w:t>unknown</w:t>
+              <w:t>county_pdfs</w:t>
             </w:r>
           </w:p>
         </w:tc>
@@ -21510,7 +21510,7 @@
           </w:tcPr>
           <w:p>
             <w:r>
-              <w:t>UNKNOWN</w:t>
+              <w:t>LIVE_PRECINCT</w:t>
             </w:r>
           </w:p>
         </w:tc>
@@ -21540,7 +21540,7 @@
           </w:tcPr>
           <w:p>
             <w:r>
-              <w:t>UND</w:t>
+              <w:t>LIVE (3)</w:t>
             </w:r>
           </w:p>
         </w:tc>
@@ -21756,7 +21756,7 @@
           </w:tcPr>
           <w:p>
             <w:r>
-              <w:t>UNKNOWN</w:t>
+              <w:t>COUNTY_ONLY_PRECINCT_AT_CANVASS</w:t>
             </w:r>
           </w:p>
         </w:tc>
@@ -21776,7 +21776,7 @@
           </w:tcPr>
           <w:p>
             <w:r>
-              <w:t>UND</w:t>
+              <w:t>LATER (3)</w:t>
             </w:r>
           </w:p>
         </w:tc>

</xml_diff>

<commit_message>
Targeted pass 3 complete and verified: Zapata primary and runoff LATER from verifier; rebuild counties.csv, docs; pilot report addendum
Co-Authored-By: Claude Opus 5.5 <noreply@anthropic.com>
Claude-Session: https://claude.ai/code/session_01SDNZBG6oNndbYxCTBGxc63
</commit_message>
<xml_diff>
--- a/full_analysis.docx
+++ b/full_analysis.docx
@@ -13,7 +13,7 @@
     </w:p>
     <w:p>
       <w:r>
-        <w:t>Phase 1 results, method, verification, and per-county detail for all 254 counties. Generated 2026-10-02 22:36 UTC.</w:t>
+        <w:t>Phase 1 results, method, verification, and per-county detail for all 254 counties. Generated 2026-10-02 23:01 UTC.</w:t>
       </w:r>
     </w:p>
     <w:p>
@@ -493,7 +493,7 @@
           </w:tcPr>
           <w:p>
             <w:r>
-              <w:t>24</w:t>
+              <w:t>27</w:t>
             </w:r>
           </w:p>
         </w:tc>
@@ -513,7 +513,7 @@
           </w:tcPr>
           <w:p>
             <w:r>
-              <w:t>11</w:t>
+              <w:t>14</w:t>
             </w:r>
           </w:p>
         </w:tc>
@@ -545,7 +545,7 @@
           </w:tcPr>
           <w:p>
             <w:r>
-              <w:t>111</w:t>
+              <w:t>126</w:t>
             </w:r>
           </w:p>
         </w:tc>
@@ -565,7 +565,7 @@
           </w:tcPr>
           <w:p>
             <w:r>
-              <w:t>58</w:t>
+              <w:t>68</w:t>
             </w:r>
           </w:p>
         </w:tc>
@@ -575,7 +575,7 @@
           </w:tcPr>
           <w:p>
             <w:r>
-              <w:t>52</w:t>
+              <w:t>57</w:t>
             </w:r>
           </w:p>
         </w:tc>
@@ -649,7 +649,7 @@
           </w:tcPr>
           <w:p>
             <w:r>
-              <w:t>92</w:t>
+              <w:t>74</w:t>
             </w:r>
           </w:p>
         </w:tc>
@@ -679,7 +679,7 @@
           </w:tcPr>
           <w:p>
             <w:r>
-              <w:t>92</w:t>
+              <w:t>74</w:t>
             </w:r>
           </w:p>
         </w:tc>
@@ -715,10 +715,10 @@
         <w:rPr>
           <w:b/>
         </w:rPr>
-        <w:t xml:space="preserve">PRECINCT_END_OF_NIGHT (24): </w:t>
+        <w:t xml:space="preserve">PRECINCT_END_OF_NIGHT (27): </w:t>
       </w:r>
       <w:r>
-        <w:t>Bandera (low), Bastrop (high), Bowie (low), Burnet (low), Chambers (med), Cochran (med), Collin (low), Cooke (med), Coryell (med), DeWitt (low), Donley (low), Fayette (med), Gillespie (low), Glasscock (low), Gregg (high), Hemphill (med), Hopkins (low), Houston (med), Jim Hogg (low), Liberty (med), Lipscomb (med), Lynn (med), Ochiltree (low), Polk (med)</w:t>
+        <w:t>Bandera (low), Bastrop (high), Bosque (med), Bowie (low), Burnet (low), Chambers (med), Cochran (med), Collin (low), Cooke (med), Coryell (med), Dawson (med), DeWitt (low), Donley (low), Fayette (med), Gillespie (low), Glasscock (low), Gregg (high), Hemphill (med), Hopkins (low), Houston (med), Hutchinson (med), Jim Hogg (low), Liberty (med), Lipscomb (med), Lynn (med), Ochiltree (low), Polk (med)</w:t>
       </w:r>
     </w:p>
     <w:p>
@@ -832,7 +832,7 @@
           </w:tcPr>
           <w:p>
             <w:r>
-              <w:t>12</w:t>
+              <w:t>15</w:t>
             </w:r>
           </w:p>
         </w:tc>
@@ -842,7 +842,7 @@
           </w:tcPr>
           <w:p>
             <w:r>
-              <w:t>56</w:t>
+              <w:t>62</w:t>
             </w:r>
           </w:p>
         </w:tc>
@@ -862,7 +862,7 @@
           </w:tcPr>
           <w:p>
             <w:r>
-              <w:t>160</w:t>
+              <w:t>151</w:t>
             </w:r>
           </w:p>
         </w:tc>
@@ -894,7 +894,7 @@
           </w:tcPr>
           <w:p>
             <w:r>
-              <w:t>17</w:t>
+              <w:t>19</w:t>
             </w:r>
           </w:p>
         </w:tc>
@@ -904,7 +904,7 @@
           </w:tcPr>
           <w:p>
             <w:r>
-              <w:t>69</w:t>
+              <w:t>81</w:t>
             </w:r>
           </w:p>
         </w:tc>
@@ -924,7 +924,7 @@
           </w:tcPr>
           <w:p>
             <w:r>
-              <w:t>143</w:t>
+              <w:t>129</w:t>
             </w:r>
           </w:p>
         </w:tc>
@@ -956,7 +956,7 @@
           </w:tcPr>
           <w:p>
             <w:r>
-              <w:t>26</w:t>
+              <w:t>29</w:t>
             </w:r>
           </w:p>
         </w:tc>
@@ -966,7 +966,7 @@
           </w:tcPr>
           <w:p>
             <w:r>
-              <w:t>85</w:t>
+              <w:t>94</w:t>
             </w:r>
           </w:p>
         </w:tc>
@@ -986,7 +986,7 @@
           </w:tcPr>
           <w:p>
             <w:r>
-              <w:t>129</w:t>
+              <w:t>117</w:t>
             </w:r>
           </w:p>
         </w:tc>
@@ -995,7 +995,7 @@
     <w:p/>
     <w:p>
       <w:r>
-        <w:t>Of 762 county-elections, 330 were determined: 82 by check 1 (vendor update log), 244 by check 2 (county-posted reports), and 4 by check 3 (Wayback captures). 432 remain UNDETERMINED.</w:t>
+        <w:t>Of 762 county-elections, 365 were determined: 82 by check 1 (vendor update log), 278 by check 2 (county-posted reports), and 5 by check 3 (Wayback captures). 397 remain UNDETERMINED.</w:t>
       </w:r>
     </w:p>
     <w:p>
@@ -1055,7 +1055,7 @@
           </w:tcPr>
           <w:p>
             <w:r>
-              <w:t>192</w:t>
+              <w:t>197</w:t>
             </w:r>
           </w:p>
         </w:tc>
@@ -1099,7 +1099,7 @@
           </w:tcPr>
           <w:p>
             <w:r>
-              <w:t>25</w:t>
+              <w:t>20</w:t>
             </w:r>
           </w:p>
         </w:tc>
@@ -1225,7 +1225,7 @@
     </w:p>
     <w:p>
       <w:r>
-        <w:t>132 counties were re-checked blind; 112 agreed with the research tag. Disagreements, set to UNKNOWN: Cherokee, Childress, Dimmit, Foard, Garza, Hamilton, Haskell, Irion, Jasper, Kent, Lamar, Robertson, San Saba, Scurry, Terrell, Throckmorton, Tyler, Zapata. Per-county detail is in phase1/verification/ and phase1/verification_log.md.</w:t>
+        <w:t>142 counties were re-checked blind; 128 agreed with the research tag. Disagreements, set to UNKNOWN: Cherokee, Childress, Dimmit, Foard, Garza, Hamilton, Irion, Kent, Lamar, Robertson, San Saba, Terrell, Throckmorton. Per-county detail is in phase1/verification/ and phase1/verification_log.md.</w:t>
       </w:r>
     </w:p>
     <w:p>
@@ -1249,7 +1249,7 @@
         <w:pStyle w:val="ListBullet"/>
       </w:pPr>
       <w:r>
-        <w:t>92 counties are UNKNOWN. Most post election-night reports that are later overwritten, use web servers that do not report upload times, or block automated requests.</w:t>
+        <w:t>74 counties are UNKNOWN. Most post election-night reports that are later overwritten, use web servers that do not report upload times, or block automated requests.</w:t>
       </w:r>
     </w:p>
     <w:p>
@@ -2814,57 +2814,57 @@
           </w:tcPr>
           <w:p>
             <w:r>
-              <w:t>UNKNOWN</w:t>
-            </w:r>
-          </w:p>
-        </w:tc>
-        <w:tc>
-          <w:tcPr>
-            <w:tcW w:type="dxa" w:w="1080"/>
-          </w:tcPr>
-          <w:p>
-            <w:r>
-              <w:t>low</w:t>
-            </w:r>
-          </w:p>
-        </w:tc>
-        <w:tc>
-          <w:tcPr>
-            <w:tcW w:type="dxa" w:w="1080"/>
-          </w:tcPr>
-          <w:p>
-            <w:r>
-              <w:t>UND</w:t>
-            </w:r>
-          </w:p>
-        </w:tc>
-        <w:tc>
-          <w:tcPr>
-            <w:tcW w:type="dxa" w:w="1080"/>
-          </w:tcPr>
-          <w:p>
-            <w:r>
-              <w:t>UND</w:t>
-            </w:r>
-          </w:p>
-        </w:tc>
-        <w:tc>
-          <w:tcPr>
-            <w:tcW w:type="dxa" w:w="1080"/>
-          </w:tcPr>
-          <w:p>
-            <w:r>
-              <w:t>UND</w:t>
-            </w:r>
-          </w:p>
-        </w:tc>
-        <w:tc>
-          <w:tcPr>
-            <w:tcW w:type="dxa" w:w="1080"/>
-          </w:tcPr>
-          <w:p>
-            <w:r>
-              <w:t>unknown</w:t>
+              <w:t>PRECINCT_END_OF_NIGHT</w:t>
+            </w:r>
+          </w:p>
+        </w:tc>
+        <w:tc>
+          <w:tcPr>
+            <w:tcW w:type="dxa" w:w="1080"/>
+          </w:tcPr>
+          <w:p>
+            <w:r>
+              <w:t>med</w:t>
+            </w:r>
+          </w:p>
+        </w:tc>
+        <w:tc>
+          <w:tcPr>
+            <w:tcW w:type="dxa" w:w="1080"/>
+          </w:tcPr>
+          <w:p>
+            <w:r>
+              <w:t>END (2)</w:t>
+            </w:r>
+          </w:p>
+        </w:tc>
+        <w:tc>
+          <w:tcPr>
+            <w:tcW w:type="dxa" w:w="1080"/>
+          </w:tcPr>
+          <w:p>
+            <w:r>
+              <w:t>END (2)</w:t>
+            </w:r>
+          </w:p>
+        </w:tc>
+        <w:tc>
+          <w:tcPr>
+            <w:tcW w:type="dxa" w:w="1080"/>
+          </w:tcPr>
+          <w:p>
+            <w:r>
+              <w:t>END (2)</w:t>
+            </w:r>
+          </w:p>
+        </w:tc>
+        <w:tc>
+          <w:tcPr>
+            <w:tcW w:type="dxa" w:w="1080"/>
+          </w:tcPr>
+          <w:p>
+            <w:r>
+              <w:t>county_pdfs</w:t>
             </w:r>
           </w:p>
         </w:tc>
@@ -3634,17 +3634,17 @@
           </w:tcPr>
           <w:p>
             <w:r>
-              <w:t>UNKNOWN</w:t>
-            </w:r>
-          </w:p>
-        </w:tc>
-        <w:tc>
-          <w:tcPr>
-            <w:tcW w:type="dxa" w:w="1080"/>
-          </w:tcPr>
-          <w:p>
-            <w:r>
-              <w:t>low</w:t>
+              <w:t>COUNTY_ONLY_PRECINCT_AT_CANVASS</w:t>
+            </w:r>
+          </w:p>
+        </w:tc>
+        <w:tc>
+          <w:tcPr>
+            <w:tcW w:type="dxa" w:w="1080"/>
+          </w:tcPr>
+          <w:p>
+            <w:r>
+              <w:t>med</w:t>
             </w:r>
           </w:p>
         </w:tc>
@@ -3664,17 +3664,17 @@
           </w:tcPr>
           <w:p>
             <w:r>
-              <w:t>UND</w:t>
-            </w:r>
-          </w:p>
-        </w:tc>
-        <w:tc>
-          <w:tcPr>
-            <w:tcW w:type="dxa" w:w="1080"/>
-          </w:tcPr>
-          <w:p>
-            <w:r>
-              <w:t>UND</w:t>
+              <w:t>LATER (2)</w:t>
+            </w:r>
+          </w:p>
+        </w:tc>
+        <w:tc>
+          <w:tcPr>
+            <w:tcW w:type="dxa" w:w="1080"/>
+          </w:tcPr>
+          <w:p>
+            <w:r>
+              <w:t>LATER (2)</w:t>
             </w:r>
           </w:p>
         </w:tc>
@@ -4782,17 +4782,27 @@
           </w:tcPr>
           <w:p>
             <w:r>
-              <w:t>UNKNOWN</w:t>
-            </w:r>
-          </w:p>
-        </w:tc>
-        <w:tc>
-          <w:tcPr>
-            <w:tcW w:type="dxa" w:w="1080"/>
-          </w:tcPr>
-          <w:p>
-            <w:r>
-              <w:t>low</w:t>
+              <w:t>COUNTY_ONLY_PRECINCT_AT_CANVASS</w:t>
+            </w:r>
+          </w:p>
+        </w:tc>
+        <w:tc>
+          <w:tcPr>
+            <w:tcW w:type="dxa" w:w="1080"/>
+          </w:tcPr>
+          <w:p>
+            <w:r>
+              <w:t>med</w:t>
+            </w:r>
+          </w:p>
+        </w:tc>
+        <w:tc>
+          <w:tcPr>
+            <w:tcW w:type="dxa" w:w="1080"/>
+          </w:tcPr>
+          <w:p>
+            <w:r>
+              <w:t>LATER (3)</w:t>
             </w:r>
           </w:p>
         </w:tc>
@@ -4812,27 +4822,17 @@
           </w:tcPr>
           <w:p>
             <w:r>
-              <w:t>UND</w:t>
-            </w:r>
-          </w:p>
-        </w:tc>
-        <w:tc>
-          <w:tcPr>
-            <w:tcW w:type="dxa" w:w="1080"/>
-          </w:tcPr>
-          <w:p>
-            <w:r>
-              <w:t>UND</w:t>
-            </w:r>
-          </w:p>
-        </w:tc>
-        <w:tc>
-          <w:tcPr>
-            <w:tcW w:type="dxa" w:w="1080"/>
-          </w:tcPr>
-          <w:p>
-            <w:r>
-              <w:t>unknown</w:t>
+              <w:t>LATER (2)</w:t>
+            </w:r>
+          </w:p>
+        </w:tc>
+        <w:tc>
+          <w:tcPr>
+            <w:tcW w:type="dxa" w:w="1080"/>
+          </w:tcPr>
+          <w:p>
+            <w:r>
+              <w:t>county_pdfs</w:t>
             </w:r>
           </w:p>
         </w:tc>
@@ -5520,7 +5520,7 @@
           </w:tcPr>
           <w:p>
             <w:r>
-              <w:t>UNKNOWN</w:t>
+              <w:t>COUNTY_ONLY_PRECINCT_AT_CANVASS</w:t>
             </w:r>
           </w:p>
         </w:tc>
@@ -5540,6 +5540,16 @@
           </w:tcPr>
           <w:p>
             <w:r>
+              <w:t>LATER (2)</w:t>
+            </w:r>
+          </w:p>
+        </w:tc>
+        <w:tc>
+          <w:tcPr>
+            <w:tcW w:type="dxa" w:w="1080"/>
+          </w:tcPr>
+          <w:p>
+            <w:r>
               <w:t>UND</w:t>
             </w:r>
           </w:p>
@@ -5560,17 +5570,7 @@
           </w:tcPr>
           <w:p>
             <w:r>
-              <w:t>UND</w:t>
-            </w:r>
-          </w:p>
-        </w:tc>
-        <w:tc>
-          <w:tcPr>
-            <w:tcW w:type="dxa" w:w="1080"/>
-          </w:tcPr>
-          <w:p>
-            <w:r>
-              <w:t>unknown</w:t>
+              <w:t>county_pdfs</w:t>
             </w:r>
           </w:p>
         </w:tc>
@@ -5684,17 +5684,17 @@
           </w:tcPr>
           <w:p>
             <w:r>
-              <w:t>UNKNOWN</w:t>
-            </w:r>
-          </w:p>
-        </w:tc>
-        <w:tc>
-          <w:tcPr>
-            <w:tcW w:type="dxa" w:w="1080"/>
-          </w:tcPr>
-          <w:p>
-            <w:r>
-              <w:t>low</w:t>
+              <w:t>COUNTY_ONLY_PRECINCT_AT_CANVASS</w:t>
+            </w:r>
+          </w:p>
+        </w:tc>
+        <w:tc>
+          <w:tcPr>
+            <w:tcW w:type="dxa" w:w="1080"/>
+          </w:tcPr>
+          <w:p>
+            <w:r>
+              <w:t>med</w:t>
             </w:r>
           </w:p>
         </w:tc>
@@ -5714,17 +5714,17 @@
           </w:tcPr>
           <w:p>
             <w:r>
-              <w:t>UND</w:t>
-            </w:r>
-          </w:p>
-        </w:tc>
-        <w:tc>
-          <w:tcPr>
-            <w:tcW w:type="dxa" w:w="1080"/>
-          </w:tcPr>
-          <w:p>
-            <w:r>
-              <w:t>UND</w:t>
+              <w:t>LATER (2)</w:t>
+            </w:r>
+          </w:p>
+        </w:tc>
+        <w:tc>
+          <w:tcPr>
+            <w:tcW w:type="dxa" w:w="1080"/>
+          </w:tcPr>
+          <w:p>
+            <w:r>
+              <w:t>LATER (2)</w:t>
             </w:r>
           </w:p>
         </w:tc>
@@ -6094,17 +6094,17 @@
           </w:tcPr>
           <w:p>
             <w:r>
-              <w:t>UNKNOWN</w:t>
-            </w:r>
-          </w:p>
-        </w:tc>
-        <w:tc>
-          <w:tcPr>
-            <w:tcW w:type="dxa" w:w="1080"/>
-          </w:tcPr>
-          <w:p>
-            <w:r>
-              <w:t>low</w:t>
+              <w:t>PRECINCT_END_OF_NIGHT</w:t>
+            </w:r>
+          </w:p>
+        </w:tc>
+        <w:tc>
+          <w:tcPr>
+            <w:tcW w:type="dxa" w:w="1080"/>
+          </w:tcPr>
+          <w:p>
+            <w:r>
+              <w:t>med</w:t>
             </w:r>
           </w:p>
         </w:tc>
@@ -6124,7 +6124,7 @@
           </w:tcPr>
           <w:p>
             <w:r>
-              <w:t>UND</w:t>
+              <w:t>END (2)</w:t>
             </w:r>
           </w:p>
         </w:tc>
@@ -9866,17 +9866,17 @@
           </w:tcPr>
           <w:p>
             <w:r>
-              <w:t>UNKNOWN</w:t>
-            </w:r>
-          </w:p>
-        </w:tc>
-        <w:tc>
-          <w:tcPr>
-            <w:tcW w:type="dxa" w:w="1080"/>
-          </w:tcPr>
-          <w:p>
-            <w:r>
-              <w:t>low</w:t>
+              <w:t>COUNTY_ONLY_PRECINCT_AT_CANVASS</w:t>
+            </w:r>
+          </w:p>
+        </w:tc>
+        <w:tc>
+          <w:tcPr>
+            <w:tcW w:type="dxa" w:w="1080"/>
+          </w:tcPr>
+          <w:p>
+            <w:r>
+              <w:t>med</w:t>
             </w:r>
           </w:p>
         </w:tc>
@@ -9896,27 +9896,27 @@
           </w:tcPr>
           <w:p>
             <w:r>
-              <w:t>UND</w:t>
-            </w:r>
-          </w:p>
-        </w:tc>
-        <w:tc>
-          <w:tcPr>
-            <w:tcW w:type="dxa" w:w="1080"/>
-          </w:tcPr>
-          <w:p>
-            <w:r>
-              <w:t>UND</w:t>
-            </w:r>
-          </w:p>
-        </w:tc>
-        <w:tc>
-          <w:tcPr>
-            <w:tcW w:type="dxa" w:w="1080"/>
-          </w:tcPr>
-          <w:p>
-            <w:r>
-              <w:t>unknown</w:t>
+              <w:t>LATER (2)</w:t>
+            </w:r>
+          </w:p>
+        </w:tc>
+        <w:tc>
+          <w:tcPr>
+            <w:tcW w:type="dxa" w:w="1080"/>
+          </w:tcPr>
+          <w:p>
+            <w:r>
+              <w:t>LATER (2)</w:t>
+            </w:r>
+          </w:p>
+        </w:tc>
+        <w:tc>
+          <w:tcPr>
+            <w:tcW w:type="dxa" w:w="1080"/>
+          </w:tcPr>
+          <w:p>
+            <w:r>
+              <w:t>county_pdfs</w:t>
             </w:r>
           </w:p>
         </w:tc>
@@ -10686,17 +10686,27 @@
           </w:tcPr>
           <w:p>
             <w:r>
-              <w:t>UNKNOWN</w:t>
-            </w:r>
-          </w:p>
-        </w:tc>
-        <w:tc>
-          <w:tcPr>
-            <w:tcW w:type="dxa" w:w="1080"/>
-          </w:tcPr>
-          <w:p>
-            <w:r>
-              <w:t>low</w:t>
+              <w:t>COUNTY_ONLY_PRECINCT_AT_CANVASS</w:t>
+            </w:r>
+          </w:p>
+        </w:tc>
+        <w:tc>
+          <w:tcPr>
+            <w:tcW w:type="dxa" w:w="1080"/>
+          </w:tcPr>
+          <w:p>
+            <w:r>
+              <w:t>med</w:t>
+            </w:r>
+          </w:p>
+        </w:tc>
+        <w:tc>
+          <w:tcPr>
+            <w:tcW w:type="dxa" w:w="1080"/>
+          </w:tcPr>
+          <w:p>
+            <w:r>
+              <w:t>LATER (2)</w:t>
             </w:r>
           </w:p>
         </w:tc>
@@ -10716,17 +10726,7 @@
           </w:tcPr>
           <w:p>
             <w:r>
-              <w:t>UND</w:t>
-            </w:r>
-          </w:p>
-        </w:tc>
-        <w:tc>
-          <w:tcPr>
-            <w:tcW w:type="dxa" w:w="1080"/>
-          </w:tcPr>
-          <w:p>
-            <w:r>
-              <w:t>UND</w:t>
+              <w:t>LATER (2)</w:t>
             </w:r>
           </w:p>
         </w:tc>
@@ -10932,47 +10932,47 @@
           </w:tcPr>
           <w:p>
             <w:r>
-              <w:t>UNKNOWN</w:t>
-            </w:r>
-          </w:p>
-        </w:tc>
-        <w:tc>
-          <w:tcPr>
-            <w:tcW w:type="dxa" w:w="1080"/>
-          </w:tcPr>
-          <w:p>
-            <w:r>
-              <w:t>low</w:t>
-            </w:r>
-          </w:p>
-        </w:tc>
-        <w:tc>
-          <w:tcPr>
-            <w:tcW w:type="dxa" w:w="1080"/>
-          </w:tcPr>
-          <w:p>
-            <w:r>
-              <w:t>UND</w:t>
-            </w:r>
-          </w:p>
-        </w:tc>
-        <w:tc>
-          <w:tcPr>
-            <w:tcW w:type="dxa" w:w="1080"/>
-          </w:tcPr>
-          <w:p>
-            <w:r>
-              <w:t>UND</w:t>
-            </w:r>
-          </w:p>
-        </w:tc>
-        <w:tc>
-          <w:tcPr>
-            <w:tcW w:type="dxa" w:w="1080"/>
-          </w:tcPr>
-          <w:p>
-            <w:r>
-              <w:t>UND</w:t>
+              <w:t>PRECINCT_END_OF_NIGHT</w:t>
+            </w:r>
+          </w:p>
+        </w:tc>
+        <w:tc>
+          <w:tcPr>
+            <w:tcW w:type="dxa" w:w="1080"/>
+          </w:tcPr>
+          <w:p>
+            <w:r>
+              <w:t>med</w:t>
+            </w:r>
+          </w:p>
+        </w:tc>
+        <w:tc>
+          <w:tcPr>
+            <w:tcW w:type="dxa" w:w="1080"/>
+          </w:tcPr>
+          <w:p>
+            <w:r>
+              <w:t>END (2)</w:t>
+            </w:r>
+          </w:p>
+        </w:tc>
+        <w:tc>
+          <w:tcPr>
+            <w:tcW w:type="dxa" w:w="1080"/>
+          </w:tcPr>
+          <w:p>
+            <w:r>
+              <w:t>LATER (2)</w:t>
+            </w:r>
+          </w:p>
+        </w:tc>
+        <w:tc>
+          <w:tcPr>
+            <w:tcW w:type="dxa" w:w="1080"/>
+          </w:tcPr>
+          <w:p>
+            <w:r>
+              <w:t>END (2)</w:t>
             </w:r>
           </w:p>
         </w:tc>
@@ -11260,7 +11260,7 @@
           </w:tcPr>
           <w:p>
             <w:r>
-              <w:t>UNKNOWN</w:t>
+              <w:t>COUNTY_ONLY_PRECINCT_AT_CANVASS</w:t>
             </w:r>
           </w:p>
         </w:tc>
@@ -11280,7 +11280,7 @@
           </w:tcPr>
           <w:p>
             <w:r>
-              <w:t>UND</w:t>
+              <w:t>LATER (2)</w:t>
             </w:r>
           </w:p>
         </w:tc>
@@ -12900,7 +12900,7 @@
           </w:tcPr>
           <w:p>
             <w:r>
-              <w:t>UNKNOWN</w:t>
+              <w:t>COUNTY_ONLY_PRECINCT_AT_CANVASS</w:t>
             </w:r>
           </w:p>
         </w:tc>
@@ -12940,7 +12940,7 @@
           </w:tcPr>
           <w:p>
             <w:r>
-              <w:t>UND</w:t>
+              <w:t>LATER (2)</w:t>
             </w:r>
           </w:p>
         </w:tc>
@@ -13556,17 +13556,17 @@
           </w:tcPr>
           <w:p>
             <w:r>
-              <w:t>UNKNOWN</w:t>
-            </w:r>
-          </w:p>
-        </w:tc>
-        <w:tc>
-          <w:tcPr>
-            <w:tcW w:type="dxa" w:w="1080"/>
-          </w:tcPr>
-          <w:p>
-            <w:r>
-              <w:t>low</w:t>
+              <w:t>COUNTY_ONLY_PRECINCT_AT_CANVASS</w:t>
+            </w:r>
+          </w:p>
+        </w:tc>
+        <w:tc>
+          <w:tcPr>
+            <w:tcW w:type="dxa" w:w="1080"/>
+          </w:tcPr>
+          <w:p>
+            <w:r>
+              <w:t>med</w:t>
             </w:r>
           </w:p>
         </w:tc>
@@ -13586,7 +13586,7 @@
           </w:tcPr>
           <w:p>
             <w:r>
-              <w:t>UND</w:t>
+              <w:t>LATER (2)</w:t>
             </w:r>
           </w:p>
         </w:tc>
@@ -14786,17 +14786,17 @@
           </w:tcPr>
           <w:p>
             <w:r>
-              <w:t>UNKNOWN</w:t>
-            </w:r>
-          </w:p>
-        </w:tc>
-        <w:tc>
-          <w:tcPr>
-            <w:tcW w:type="dxa" w:w="1080"/>
-          </w:tcPr>
-          <w:p>
-            <w:r>
-              <w:t>low</w:t>
+              <w:t>COUNTY_ONLY_PRECINCT_AT_CANVASS</w:t>
+            </w:r>
+          </w:p>
+        </w:tc>
+        <w:tc>
+          <w:tcPr>
+            <w:tcW w:type="dxa" w:w="1080"/>
+          </w:tcPr>
+          <w:p>
+            <w:r>
+              <w:t>med</w:t>
             </w:r>
           </w:p>
         </w:tc>
@@ -14816,27 +14816,27 @@
           </w:tcPr>
           <w:p>
             <w:r>
-              <w:t>UND</w:t>
-            </w:r>
-          </w:p>
-        </w:tc>
-        <w:tc>
-          <w:tcPr>
-            <w:tcW w:type="dxa" w:w="1080"/>
-          </w:tcPr>
-          <w:p>
-            <w:r>
-              <w:t>UND</w:t>
-            </w:r>
-          </w:p>
-        </w:tc>
-        <w:tc>
-          <w:tcPr>
-            <w:tcW w:type="dxa" w:w="1080"/>
-          </w:tcPr>
-          <w:p>
-            <w:r>
-              <w:t>unknown</w:t>
+              <w:t>LATER (2)</w:t>
+            </w:r>
+          </w:p>
+        </w:tc>
+        <w:tc>
+          <w:tcPr>
+            <w:tcW w:type="dxa" w:w="1080"/>
+          </w:tcPr>
+          <w:p>
+            <w:r>
+              <w:t>LATER (2)</w:t>
+            </w:r>
+          </w:p>
+        </w:tc>
+        <w:tc>
+          <w:tcPr>
+            <w:tcW w:type="dxa" w:w="1080"/>
+          </w:tcPr>
+          <w:p>
+            <w:r>
+              <w:t>county_pdfs</w:t>
             </w:r>
           </w:p>
         </w:tc>
@@ -16508,47 +16508,47 @@
           </w:tcPr>
           <w:p>
             <w:r>
-              <w:t>UNKNOWN</w:t>
-            </w:r>
-          </w:p>
-        </w:tc>
-        <w:tc>
-          <w:tcPr>
-            <w:tcW w:type="dxa" w:w="1080"/>
-          </w:tcPr>
-          <w:p>
-            <w:r>
-              <w:t>low</w:t>
-            </w:r>
-          </w:p>
-        </w:tc>
-        <w:tc>
-          <w:tcPr>
-            <w:tcW w:type="dxa" w:w="1080"/>
-          </w:tcPr>
-          <w:p>
-            <w:r>
-              <w:t>UND</w:t>
-            </w:r>
-          </w:p>
-        </w:tc>
-        <w:tc>
-          <w:tcPr>
-            <w:tcW w:type="dxa" w:w="1080"/>
-          </w:tcPr>
-          <w:p>
-            <w:r>
-              <w:t>UND</w:t>
-            </w:r>
-          </w:p>
-        </w:tc>
-        <w:tc>
-          <w:tcPr>
-            <w:tcW w:type="dxa" w:w="1080"/>
-          </w:tcPr>
-          <w:p>
-            <w:r>
-              <w:t>UND</w:t>
+              <w:t>COUNTY_ONLY_PRECINCT_AT_CANVASS</w:t>
+            </w:r>
+          </w:p>
+        </w:tc>
+        <w:tc>
+          <w:tcPr>
+            <w:tcW w:type="dxa" w:w="1080"/>
+          </w:tcPr>
+          <w:p>
+            <w:r>
+              <w:t>med</w:t>
+            </w:r>
+          </w:p>
+        </w:tc>
+        <w:tc>
+          <w:tcPr>
+            <w:tcW w:type="dxa" w:w="1080"/>
+          </w:tcPr>
+          <w:p>
+            <w:r>
+              <w:t>LATER (2)</w:t>
+            </w:r>
+          </w:p>
+        </w:tc>
+        <w:tc>
+          <w:tcPr>
+            <w:tcW w:type="dxa" w:w="1080"/>
+          </w:tcPr>
+          <w:p>
+            <w:r>
+              <w:t>LATER (2)</w:t>
+            </w:r>
+          </w:p>
+        </w:tc>
+        <w:tc>
+          <w:tcPr>
+            <w:tcW w:type="dxa" w:w="1080"/>
+          </w:tcPr>
+          <w:p>
+            <w:r>
+              <w:t>END (2)</w:t>
             </w:r>
           </w:p>
         </w:tc>
@@ -18394,7 +18394,7 @@
           </w:tcPr>
           <w:p>
             <w:r>
-              <w:t>UNKNOWN</w:t>
+              <w:t>COUNTY_ONLY_PRECINCT_AT_CANVASS</w:t>
             </w:r>
           </w:p>
         </w:tc>
@@ -18424,7 +18424,7 @@
           </w:tcPr>
           <w:p>
             <w:r>
-              <w:t>UND</w:t>
+              <w:t>LATER (2)</w:t>
             </w:r>
           </w:p>
         </w:tc>
@@ -20116,7 +20116,7 @@
           </w:tcPr>
           <w:p>
             <w:r>
-              <w:t>UNKNOWN</w:t>
+              <w:t>COUNTY_ONLY_PRECINCT_AT_CANVASS</w:t>
             </w:r>
           </w:p>
         </w:tc>
@@ -20146,7 +20146,7 @@
           </w:tcPr>
           <w:p>
             <w:r>
-              <w:t>UND</w:t>
+              <w:t>LATER (2)</w:t>
             </w:r>
           </w:p>
         </w:tc>
@@ -20444,17 +20444,17 @@
           </w:tcPr>
           <w:p>
             <w:r>
-              <w:t>UNKNOWN</w:t>
-            </w:r>
-          </w:p>
-        </w:tc>
-        <w:tc>
-          <w:tcPr>
-            <w:tcW w:type="dxa" w:w="1080"/>
-          </w:tcPr>
-          <w:p>
-            <w:r>
-              <w:t>low</w:t>
+              <w:t>COUNTY_ONLY_PRECINCT_AT_CANVASS</w:t>
+            </w:r>
+          </w:p>
+        </w:tc>
+        <w:tc>
+          <w:tcPr>
+            <w:tcW w:type="dxa" w:w="1080"/>
+          </w:tcPr>
+          <w:p>
+            <w:r>
+              <w:t>med</w:t>
             </w:r>
           </w:p>
         </w:tc>
@@ -20474,17 +20474,17 @@
           </w:tcPr>
           <w:p>
             <w:r>
-              <w:t>UND</w:t>
-            </w:r>
-          </w:p>
-        </w:tc>
-        <w:tc>
-          <w:tcPr>
-            <w:tcW w:type="dxa" w:w="1080"/>
-          </w:tcPr>
-          <w:p>
-            <w:r>
-              <w:t>UND</w:t>
+              <w:t>LATER (2)</w:t>
+            </w:r>
+          </w:p>
+        </w:tc>
+        <w:tc>
+          <w:tcPr>
+            <w:tcW w:type="dxa" w:w="1080"/>
+          </w:tcPr>
+          <w:p>
+            <w:r>
+              <w:t>LATER (2)</w:t>
             </w:r>
           </w:p>
         </w:tc>
@@ -20956,17 +20956,17 @@
           </w:tcPr>
           <w:p>
             <w:r>
-              <w:t>UND</w:t>
-            </w:r>
-          </w:p>
-        </w:tc>
-        <w:tc>
-          <w:tcPr>
-            <w:tcW w:type="dxa" w:w="1080"/>
-          </w:tcPr>
-          <w:p>
-            <w:r>
-              <w:t>UND</w:t>
+              <w:t>END (2)</w:t>
+            </w:r>
+          </w:p>
+        </w:tc>
+        <w:tc>
+          <w:tcPr>
+            <w:tcW w:type="dxa" w:w="1080"/>
+          </w:tcPr>
+          <w:p>
+            <w:r>
+              <w:t>LATER (2)</w:t>
             </w:r>
           </w:p>
         </w:tc>
@@ -22084,47 +22084,47 @@
           </w:tcPr>
           <w:p>
             <w:r>
-              <w:t>UNKNOWN</w:t>
-            </w:r>
-          </w:p>
-        </w:tc>
-        <w:tc>
-          <w:tcPr>
-            <w:tcW w:type="dxa" w:w="1080"/>
-          </w:tcPr>
-          <w:p>
-            <w:r>
-              <w:t>low</w:t>
-            </w:r>
-          </w:p>
-        </w:tc>
-        <w:tc>
-          <w:tcPr>
-            <w:tcW w:type="dxa" w:w="1080"/>
-          </w:tcPr>
-          <w:p>
-            <w:r>
-              <w:t>UND</w:t>
-            </w:r>
-          </w:p>
-        </w:tc>
-        <w:tc>
-          <w:tcPr>
-            <w:tcW w:type="dxa" w:w="1080"/>
-          </w:tcPr>
-          <w:p>
-            <w:r>
-              <w:t>UND</w:t>
-            </w:r>
-          </w:p>
-        </w:tc>
-        <w:tc>
-          <w:tcPr>
-            <w:tcW w:type="dxa" w:w="1080"/>
-          </w:tcPr>
-          <w:p>
-            <w:r>
-              <w:t>UND</w:t>
+              <w:t>COUNTY_ONLY_PRECINCT_AT_CANVASS</w:t>
+            </w:r>
+          </w:p>
+        </w:tc>
+        <w:tc>
+          <w:tcPr>
+            <w:tcW w:type="dxa" w:w="1080"/>
+          </w:tcPr>
+          <w:p>
+            <w:r>
+              <w:t>med</w:t>
+            </w:r>
+          </w:p>
+        </w:tc>
+        <w:tc>
+          <w:tcPr>
+            <w:tcW w:type="dxa" w:w="1080"/>
+          </w:tcPr>
+          <w:p>
+            <w:r>
+              <w:t>LATER (2)</w:t>
+            </w:r>
+          </w:p>
+        </w:tc>
+        <w:tc>
+          <w:tcPr>
+            <w:tcW w:type="dxa" w:w="1080"/>
+          </w:tcPr>
+          <w:p>
+            <w:r>
+              <w:t>LATER (2)</w:t>
+            </w:r>
+          </w:p>
+        </w:tc>
+        <w:tc>
+          <w:tcPr>
+            <w:tcW w:type="dxa" w:w="1080"/>
+          </w:tcPr>
+          <w:p>
+            <w:r>
+              <w:t>LATER (2)</w:t>
             </w:r>
           </w:p>
         </w:tc>

</xml_diff>

<commit_message>
Verifier-17 agrees on Grayson and Tom Green; Tom Green quote fixed; rebuild counties.csv and docs
Co-Authored-By: Claude Opus 5.5 <noreply@anthropic.com>
Claude-Session: https://claude.ai/code/session_01SDNZBG6oNndbYxCTBGxc63
</commit_message>
<xml_diff>
--- a/full_analysis.docx
+++ b/full_analysis.docx
@@ -13,7 +13,7 @@
     </w:p>
     <w:p>
       <w:r>
-        <w:t>Phase 1 results, method, verification, and per-county detail for all 254 counties. Generated 2026-10-02 23:01 UTC.</w:t>
+        <w:t>Phase 1 results, method, verification, and per-county detail for all 254 counties. Generated 2026-10-03 00:15 UTC.</w:t>
       </w:r>
     </w:p>
     <w:p>
@@ -545,7 +545,7 @@
           </w:tcPr>
           <w:p>
             <w:r>
-              <w:t>126</w:t>
+              <w:t>131</w:t>
             </w:r>
           </w:p>
         </w:tc>
@@ -565,7 +565,7 @@
           </w:tcPr>
           <w:p>
             <w:r>
-              <w:t>68</w:t>
+              <w:t>70</w:t>
             </w:r>
           </w:p>
         </w:tc>
@@ -575,7 +575,7 @@
           </w:tcPr>
           <w:p>
             <w:r>
-              <w:t>57</w:t>
+              <w:t>60</w:t>
             </w:r>
           </w:p>
         </w:tc>
@@ -649,7 +649,7 @@
           </w:tcPr>
           <w:p>
             <w:r>
-              <w:t>74</w:t>
+              <w:t>69</w:t>
             </w:r>
           </w:p>
         </w:tc>
@@ -679,7 +679,7 @@
           </w:tcPr>
           <w:p>
             <w:r>
-              <w:t>74</w:t>
+              <w:t>69</w:t>
             </w:r>
           </w:p>
         </w:tc>
@@ -842,7 +842,7 @@
           </w:tcPr>
           <w:p>
             <w:r>
-              <w:t>62</w:t>
+              <w:t>64</w:t>
             </w:r>
           </w:p>
         </w:tc>
@@ -862,7 +862,7 @@
           </w:tcPr>
           <w:p>
             <w:r>
-              <w:t>151</w:t>
+              <w:t>149</w:t>
             </w:r>
           </w:p>
         </w:tc>
@@ -904,7 +904,7 @@
           </w:tcPr>
           <w:p>
             <w:r>
-              <w:t>81</w:t>
+              <w:t>85</w:t>
             </w:r>
           </w:p>
         </w:tc>
@@ -924,7 +924,7 @@
           </w:tcPr>
           <w:p>
             <w:r>
-              <w:t>129</w:t>
+              <w:t>125</w:t>
             </w:r>
           </w:p>
         </w:tc>
@@ -995,7 +995,7 @@
     <w:p/>
     <w:p>
       <w:r>
-        <w:t>Of 762 county-elections, 365 were determined: 82 by check 1 (vendor update log), 278 by check 2 (county-posted reports), and 5 by check 3 (Wayback captures). 397 remain UNDETERMINED.</w:t>
+        <w:t>Of 762 county-elections, 371 were determined: 82 by check 1 (vendor update log), 284 by check 2 (county-posted reports), and 5 by check 3 (Wayback captures). 391 remain UNDETERMINED.</w:t>
       </w:r>
     </w:p>
     <w:p>
@@ -1225,7 +1225,7 @@
     </w:p>
     <w:p>
       <w:r>
-        <w:t>142 counties were re-checked blind; 128 agreed with the research tag. Disagreements, set to UNKNOWN: Cherokee, Childress, Dimmit, Foard, Garza, Hamilton, Irion, Kent, Lamar, Robertson, San Saba, Terrell, Throckmorton. Per-county detail is in phase1/verification/ and phase1/verification_log.md.</w:t>
+        <w:t>148 counties were re-checked blind; 134 agreed with the research tag. Disagreements, set to UNKNOWN: Cherokee, Childress, Dimmit, Foard, Garza, Hamilton, Irion, Kent, Lamar, Robertson, San Saba, Terrell, Throckmorton. Per-county detail is in phase1/verification/ and phase1/verification_log.md.</w:t>
       </w:r>
     </w:p>
     <w:p>
@@ -1249,7 +1249,7 @@
         <w:pStyle w:val="ListBullet"/>
       </w:pPr>
       <w:r>
-        <w:t>74 counties are UNKNOWN. Most post election-night reports that are later overwritten, use web servers that do not report upload times, or block automated requests.</w:t>
+        <w:t>69 counties are UNKNOWN. Most post election-night reports that are later overwritten, use web servers that do not report upload times, or block automated requests.</w:t>
       </w:r>
     </w:p>
     <w:p>
@@ -1584,7 +1584,7 @@
           </w:tcPr>
           <w:p>
             <w:r>
-              <w:t>UNKNOWN</w:t>
+              <w:t>COUNTY_ONLY_PRECINCT_AT_CANVASS</w:t>
             </w:r>
           </w:p>
         </w:tc>
@@ -1614,7 +1614,7 @@
           </w:tcPr>
           <w:p>
             <w:r>
-              <w:t>UND</w:t>
+              <w:t>LATER (2)</w:t>
             </w:r>
           </w:p>
         </w:tc>
@@ -4412,7 +4412,7 @@
           </w:tcPr>
           <w:p>
             <w:r>
-              <w:t>LATER (2)</w:t>
+              <w:t>UND</w:t>
             </w:r>
           </w:p>
         </w:tc>
@@ -8800,7 +8800,7 @@
           </w:tcPr>
           <w:p>
             <w:r>
-              <w:t>UNKNOWN</w:t>
+              <w:t>COUNTY_ONLY_PRECINCT_AT_CANVASS</w:t>
             </w:r>
           </w:p>
         </w:tc>
@@ -8820,7 +8820,7 @@
           </w:tcPr>
           <w:p>
             <w:r>
-              <w:t>UND</w:t>
+              <w:t>LATER (2)</w:t>
             </w:r>
           </w:p>
         </w:tc>
@@ -9784,7 +9784,7 @@
           </w:tcPr>
           <w:p>
             <w:r>
-              <w:t>COUNTY_ONLY_PRECINCT_AT_CANVASS</w:t>
+              <w:t>UNKNOWN</w:t>
             </w:r>
           </w:p>
         </w:tc>
@@ -9804,7 +9804,7 @@
           </w:tcPr>
           <w:p>
             <w:r>
-              <w:t>LATER (2)</w:t>
+              <w:t>UND</w:t>
             </w:r>
           </w:p>
         </w:tc>
@@ -14704,7 +14704,7 @@
           </w:tcPr>
           <w:p>
             <w:r>
-              <w:t>UNKNOWN</w:t>
+              <w:t>COUNTY_ONLY_PRECINCT_AT_CANVASS</w:t>
             </w:r>
           </w:p>
         </w:tc>
@@ -14734,7 +14734,7 @@
           </w:tcPr>
           <w:p>
             <w:r>
-              <w:t>UND</w:t>
+              <w:t>LATER (2)</w:t>
             </w:r>
           </w:p>
         </w:tc>
@@ -18148,37 +18148,37 @@
           </w:tcPr>
           <w:p>
             <w:r>
-              <w:t>UNKNOWN</w:t>
-            </w:r>
-          </w:p>
-        </w:tc>
-        <w:tc>
-          <w:tcPr>
-            <w:tcW w:type="dxa" w:w="1080"/>
-          </w:tcPr>
-          <w:p>
-            <w:r>
-              <w:t>low</w:t>
-            </w:r>
-          </w:p>
-        </w:tc>
-        <w:tc>
-          <w:tcPr>
-            <w:tcW w:type="dxa" w:w="1080"/>
-          </w:tcPr>
-          <w:p>
-            <w:r>
-              <w:t>UND</w:t>
-            </w:r>
-          </w:p>
-        </w:tc>
-        <w:tc>
-          <w:tcPr>
-            <w:tcW w:type="dxa" w:w="1080"/>
-          </w:tcPr>
-          <w:p>
-            <w:r>
-              <w:t>UND</w:t>
+              <w:t>COUNTY_ONLY_PRECINCT_AT_CANVASS</w:t>
+            </w:r>
+          </w:p>
+        </w:tc>
+        <w:tc>
+          <w:tcPr>
+            <w:tcW w:type="dxa" w:w="1080"/>
+          </w:tcPr>
+          <w:p>
+            <w:r>
+              <w:t>med</w:t>
+            </w:r>
+          </w:p>
+        </w:tc>
+        <w:tc>
+          <w:tcPr>
+            <w:tcW w:type="dxa" w:w="1080"/>
+          </w:tcPr>
+          <w:p>
+            <w:r>
+              <w:t>LATER (2)</w:t>
+            </w:r>
+          </w:p>
+        </w:tc>
+        <w:tc>
+          <w:tcPr>
+            <w:tcW w:type="dxa" w:w="1080"/>
+          </w:tcPr>
+          <w:p>
+            <w:r>
+              <w:t>LATER (2)</w:t>
             </w:r>
           </w:p>
         </w:tc>
@@ -19870,17 +19870,17 @@
           </w:tcPr>
           <w:p>
             <w:r>
-              <w:t>UNKNOWN</w:t>
-            </w:r>
-          </w:p>
-        </w:tc>
-        <w:tc>
-          <w:tcPr>
-            <w:tcW w:type="dxa" w:w="1080"/>
-          </w:tcPr>
-          <w:p>
-            <w:r>
-              <w:t>low</w:t>
+              <w:t>COUNTY_ONLY_PRECINCT_AT_CANVASS</w:t>
+            </w:r>
+          </w:p>
+        </w:tc>
+        <w:tc>
+          <w:tcPr>
+            <w:tcW w:type="dxa" w:w="1080"/>
+          </w:tcPr>
+          <w:p>
+            <w:r>
+              <w:t>med</w:t>
             </w:r>
           </w:p>
         </w:tc>
@@ -19900,17 +19900,17 @@
           </w:tcPr>
           <w:p>
             <w:r>
-              <w:t>UND</w:t>
-            </w:r>
-          </w:p>
-        </w:tc>
-        <w:tc>
-          <w:tcPr>
-            <w:tcW w:type="dxa" w:w="1080"/>
-          </w:tcPr>
-          <w:p>
-            <w:r>
-              <w:t>UND</w:t>
+              <w:t>LATER (2)</w:t>
+            </w:r>
+          </w:p>
+        </w:tc>
+        <w:tc>
+          <w:tcPr>
+            <w:tcW w:type="dxa" w:w="1080"/>
+          </w:tcPr>
+          <w:p>
+            <w:r>
+              <w:t>LATER (2)</w:t>
             </w:r>
           </w:p>
         </w:tc>
@@ -20772,7 +20772,7 @@
           </w:tcPr>
           <w:p>
             <w:r>
-              <w:t>UNKNOWN</w:t>
+              <w:t>COUNTY_ONLY_PRECINCT_AT_CANVASS</w:t>
             </w:r>
           </w:p>
         </w:tc>
@@ -20792,7 +20792,7 @@
           </w:tcPr>
           <w:p>
             <w:r>
-              <w:t>UND</w:t>
+              <w:t>LATER (2)</w:t>
             </w:r>
           </w:p>
         </w:tc>

</xml_diff>

<commit_message>
Verifier-18: Guadalupe agrees; Ellis disagrees on live precinct view wording (UNKNOWN pending owner); rebuild
Co-Authored-By: Claude Opus 5.5 <noreply@anthropic.com>
Claude-Session: https://claude.ai/code/session_01SDNZBG6oNndbYxCTBGxc63
</commit_message>
<xml_diff>
--- a/full_analysis.docx
+++ b/full_analysis.docx
@@ -13,7 +13,7 @@
     </w:p>
     <w:p>
       <w:r>
-        <w:t>Phase 1 results, method, verification, and per-county detail for all 254 counties. Generated 2026-10-03 00:15 UTC.</w:t>
+        <w:t>Phase 1 results, method, verification, and per-county detail for all 254 counties. Generated 2026-10-03 02:27 UTC.</w:t>
       </w:r>
     </w:p>
     <w:p>
@@ -545,7 +545,7 @@
           </w:tcPr>
           <w:p>
             <w:r>
-              <w:t>131</w:t>
+              <w:t>132</w:t>
             </w:r>
           </w:p>
         </w:tc>
@@ -575,7 +575,7 @@
           </w:tcPr>
           <w:p>
             <w:r>
-              <w:t>60</w:t>
+              <w:t>61</w:t>
             </w:r>
           </w:p>
         </w:tc>
@@ -649,7 +649,7 @@
           </w:tcPr>
           <w:p>
             <w:r>
-              <w:t>69</w:t>
+              <w:t>68</w:t>
             </w:r>
           </w:p>
         </w:tc>
@@ -679,7 +679,7 @@
           </w:tcPr>
           <w:p>
             <w:r>
-              <w:t>69</w:t>
+              <w:t>68</w:t>
             </w:r>
           </w:p>
         </w:tc>
@@ -842,7 +842,7 @@
           </w:tcPr>
           <w:p>
             <w:r>
-              <w:t>64</w:t>
+              <w:t>65</w:t>
             </w:r>
           </w:p>
         </w:tc>
@@ -862,7 +862,7 @@
           </w:tcPr>
           <w:p>
             <w:r>
-              <w:t>149</w:t>
+              <w:t>148</w:t>
             </w:r>
           </w:p>
         </w:tc>
@@ -884,7 +884,7 @@
           </w:tcPr>
           <w:p>
             <w:r>
-              <w:t>25</w:t>
+              <w:t>26</w:t>
             </w:r>
           </w:p>
         </w:tc>
@@ -904,7 +904,7 @@
           </w:tcPr>
           <w:p>
             <w:r>
-              <w:t>85</w:t>
+              <w:t>86</w:t>
             </w:r>
           </w:p>
         </w:tc>
@@ -924,7 +924,7 @@
           </w:tcPr>
           <w:p>
             <w:r>
-              <w:t>125</w:t>
+              <w:t>123</w:t>
             </w:r>
           </w:p>
         </w:tc>
@@ -995,7 +995,7 @@
     <w:p/>
     <w:p>
       <w:r>
-        <w:t>Of 762 county-elections, 371 were determined: 82 by check 1 (vendor update log), 284 by check 2 (county-posted reports), and 5 by check 3 (Wayback captures). 391 remain UNDETERMINED.</w:t>
+        <w:t>Of 762 county-elections, 374 were determined: 82 by check 1 (vendor update log), 286 by check 2 (county-posted reports), and 6 by check 3 (Wayback captures). 388 remain UNDETERMINED.</w:t>
       </w:r>
     </w:p>
     <w:p>
@@ -1225,7 +1225,7 @@
     </w:p>
     <w:p>
       <w:r>
-        <w:t>148 counties were re-checked blind; 134 agreed with the research tag. Disagreements, set to UNKNOWN: Cherokee, Childress, Dimmit, Foard, Garza, Hamilton, Irion, Kent, Lamar, Robertson, San Saba, Terrell, Throckmorton. Per-county detail is in phase1/verification/ and phase1/verification_log.md.</w:t>
+        <w:t>150 counties were re-checked blind; 135 agreed with the research tag. Disagreements, set to UNKNOWN: Cherokee, Childress, Dimmit, Ellis, Foard, Garza, Hamilton, Irion, Kent, Lamar, Robertson, San Saba, Terrell, Throckmorton. Per-county detail is in phase1/verification/ and phase1/verification_log.md.</w:t>
       </w:r>
     </w:p>
     <w:p>
@@ -1249,7 +1249,7 @@
         <w:pStyle w:val="ListBullet"/>
       </w:pPr>
       <w:r>
-        <w:t>69 counties are UNKNOWN. Most post election-night reports that are later overwritten, use web servers that do not report upload times, or block automated requests.</w:t>
+        <w:t>68 counties are UNKNOWN. Most post election-night reports that are later overwritten, use web servers that do not report upload times, or block automated requests.</w:t>
       </w:r>
     </w:p>
     <w:p>
@@ -7190,7 +7190,7 @@
           </w:tcPr>
           <w:p>
             <w:r>
-              <w:t>UND</w:t>
+              <w:t>LIVE (3)</w:t>
             </w:r>
           </w:p>
         </w:tc>
@@ -9046,7 +9046,7 @@
           </w:tcPr>
           <w:p>
             <w:r>
-              <w:t>UNKNOWN</w:t>
+              <w:t>COUNTY_ONLY_PRECINCT_AT_CANVASS</w:t>
             </w:r>
           </w:p>
         </w:tc>
@@ -9076,7 +9076,7 @@
           </w:tcPr>
           <w:p>
             <w:r>
-              <w:t>UND</w:t>
+              <w:t>LATER (2)</w:t>
             </w:r>
           </w:p>
         </w:tc>
@@ -19890,7 +19890,7 @@
           </w:tcPr>
           <w:p>
             <w:r>
-              <w:t>UND</w:t>
+              <w:t>LATER (2)</w:t>
             </w:r>
           </w:p>
         </w:tc>

</xml_diff>

<commit_message>
Ellis LIVE_PRECINCT (low) verified under owner ruling (DECISIONS 75); rebuild
Co-Authored-By: Claude Opus 5.5 <noreply@anthropic.com>
Claude-Session: https://claude.ai/code/session_01SDNZBG6oNndbYxCTBGxc63
</commit_message>
<xml_diff>
--- a/full_analysis.docx
+++ b/full_analysis.docx
@@ -13,7 +13,7 @@
     </w:p>
     <w:p>
       <w:r>
-        <w:t>Phase 1 results, method, verification, and per-county detail for all 254 counties. Generated 2026-10-03 02:27 UTC.</w:t>
+        <w:t>Phase 1 results, method, verification, and per-county detail for all 254 counties. Generated 2026-10-03 02:29 UTC.</w:t>
       </w:r>
     </w:p>
     <w:p>
@@ -441,7 +441,7 @@
           </w:tcPr>
           <w:p>
             <w:r>
-              <w:t>26</w:t>
+              <w:t>27</w:t>
             </w:r>
           </w:p>
         </w:tc>
@@ -471,7 +471,7 @@
           </w:tcPr>
           <w:p>
             <w:r>
-              <w:t>3</w:t>
+              <w:t>4</w:t>
             </w:r>
           </w:p>
         </w:tc>
@@ -649,7 +649,7 @@
           </w:tcPr>
           <w:p>
             <w:r>
-              <w:t>68</w:t>
+              <w:t>67</w:t>
             </w:r>
           </w:p>
         </w:tc>
@@ -679,7 +679,7 @@
           </w:tcPr>
           <w:p>
             <w:r>
-              <w:t>68</w:t>
+              <w:t>67</w:t>
             </w:r>
           </w:p>
         </w:tc>
@@ -704,10 +704,10 @@
         <w:rPr>
           <w:b/>
         </w:rPr>
-        <w:t xml:space="preserve">LIVE_PRECINCT (26): </w:t>
+        <w:t xml:space="preserve">LIVE_PRECINCT (27): </w:t>
       </w:r>
       <w:r>
-        <w:t>Bell (low), Bexar (high), Comal (low), Dallas (high), Denton (high), El Paso (high), Fort Bend (high), Galveston (high), Harris (med), Hidalgo (high), Hunt (high), Jefferson (high), Kaufman (high), Kendall (high), Lubbock (med), Midland (high), Montague (high), Nueces (high), Parker (high), Rockwall (high), Rusk (high), Tarrant (high), Travis (high), Victoria (high), Williamson (low), Wood (high)</w:t>
+        <w:t>Bell (low), Bexar (high), Comal (low), Dallas (high), Denton (high), El Paso (high), Ellis (low), Fort Bend (high), Galveston (high), Harris (med), Hidalgo (high), Hunt (high), Jefferson (high), Kaufman (high), Kendall (high), Lubbock (med), Midland (high), Montague (high), Nueces (high), Parker (high), Rockwall (high), Rusk (high), Tarrant (high), Travis (high), Victoria (high), Williamson (low), Wood (high)</w:t>
       </w:r>
     </w:p>
     <w:p>
@@ -1225,7 +1225,7 @@
     </w:p>
     <w:p>
       <w:r>
-        <w:t>150 counties were re-checked blind; 135 agreed with the research tag. Disagreements, set to UNKNOWN: Cherokee, Childress, Dimmit, Ellis, Foard, Garza, Hamilton, Irion, Kent, Lamar, Robertson, San Saba, Terrell, Throckmorton. Per-county detail is in phase1/verification/ and phase1/verification_log.md.</w:t>
+        <w:t>150 counties were re-checked blind; 136 agreed with the research tag. Disagreements, set to UNKNOWN: Cherokee, Childress, Dimmit, Foard, Garza, Hamilton, Irion, Kent, Lamar, Robertson, San Saba, Terrell, Throckmorton. Per-county detail is in phase1/verification/ and phase1/verification_log.md.</w:t>
       </w:r>
     </w:p>
     <w:p>
@@ -1249,7 +1249,7 @@
         <w:pStyle w:val="ListBullet"/>
       </w:pPr>
       <w:r>
-        <w:t>68 counties are UNKNOWN. Most post election-night reports that are later overwritten, use web servers that do not report upload times, or block automated requests.</w:t>
+        <w:t>67 counties are UNKNOWN. Most post election-night reports that are later overwritten, use web servers that do not report upload times, or block automated requests.</w:t>
       </w:r>
     </w:p>
     <w:p>
@@ -7160,7 +7160,7 @@
           </w:tcPr>
           <w:p>
             <w:r>
-              <w:t>UNKNOWN</w:t>
+              <w:t>LIVE_PRECINCT</w:t>
             </w:r>
           </w:p>
         </w:tc>

</xml_diff>

<commit_message>
Van Zandt runoff LATER from owner-approved fetch (county totals uploaded 9:31 PM and 11:16 PM); confidence med
Co-Authored-By: Claude Opus 5.5 <noreply@anthropic.com>
Claude-Session: https://claude.ai/code/session_01SDNZBG6oNndbYxCTBGxc63
</commit_message>
<xml_diff>
--- a/full_analysis.docx
+++ b/full_analysis.docx
@@ -13,7 +13,7 @@
     </w:p>
     <w:p>
       <w:r>
-        <w:t>Phase 1 results, method, verification, and per-county detail for all 254 counties. Generated 2026-10-03 02:29 UTC.</w:t>
+        <w:t>Phase 1 results, method, verification, and per-county detail for all 254 counties. Generated 2026-10-03 04:39 UTC.</w:t>
       </w:r>
     </w:p>
     <w:p>
@@ -565,7 +565,7 @@
           </w:tcPr>
           <w:p>
             <w:r>
-              <w:t>70</w:t>
+              <w:t>71</w:t>
             </w:r>
           </w:p>
         </w:tc>
@@ -575,7 +575,7 @@
           </w:tcPr>
           <w:p>
             <w:r>
-              <w:t>61</w:t>
+              <w:t>60</w:t>
             </w:r>
           </w:p>
         </w:tc>
@@ -966,7 +966,7 @@
           </w:tcPr>
           <w:p>
             <w:r>
-              <w:t>94</w:t>
+              <w:t>95</w:t>
             </w:r>
           </w:p>
         </w:tc>
@@ -986,7 +986,7 @@
           </w:tcPr>
           <w:p>
             <w:r>
-              <w:t>117</w:t>
+              <w:t>116</w:t>
             </w:r>
           </w:p>
         </w:tc>
@@ -995,7 +995,7 @@
     <w:p/>
     <w:p>
       <w:r>
-        <w:t>Of 762 county-elections, 374 were determined: 82 by check 1 (vendor update log), 286 by check 2 (county-posted reports), and 6 by check 3 (Wayback captures). 388 remain UNDETERMINED.</w:t>
+        <w:t>Of 762 county-elections, 375 were determined: 82 by check 1 (vendor update log), 287 by check 2 (county-posted reports), and 6 by check 3 (Wayback captures). 387 remain UNDETERMINED.</w:t>
       </w:r>
     </w:p>
     <w:p>
@@ -20536,7 +20536,7 @@
           </w:tcPr>
           <w:p>
             <w:r>
-              <w:t>low</w:t>
+              <w:t>med</w:t>
             </w:r>
           </w:p>
         </w:tc>
@@ -20566,7 +20566,7 @@
           </w:tcPr>
           <w:p>
             <w:r>
-              <w:t>UND</w:t>
+              <w:t>LATER (2)</w:t>
             </w:r>
           </w:p>
         </w:tc>

</xml_diff>

<commit_message>
Check 3 after full harvest: Cooke, Harris, Hill, Upshur elections decided (no tag changes); Bell runoff note; rebuild
Co-Authored-By: Claude Opus 5.5 <noreply@anthropic.com>
Claude-Session: https://claude.ai/code/session_01SDNZBG6oNndbYxCTBGxc63
</commit_message>
<xml_diff>
--- a/full_analysis.docx
+++ b/full_analysis.docx
@@ -13,7 +13,7 @@
     </w:p>
     <w:p>
       <w:r>
-        <w:t>Phase 1 results, method, verification, and per-county detail for all 254 counties. Generated 2026-10-03 04:39 UTC.</w:t>
+        <w:t>Phase 1 results, method, verification, and per-county detail for all 254 counties. Generated 2026-10-03 11:34 UTC.</w:t>
       </w:r>
     </w:p>
     <w:p>
@@ -565,7 +565,7 @@
           </w:tcPr>
           <w:p>
             <w:r>
-              <w:t>71</w:t>
+              <w:t>72</w:t>
             </w:r>
           </w:p>
         </w:tc>
@@ -575,7 +575,7 @@
           </w:tcPr>
           <w:p>
             <w:r>
-              <w:t>60</w:t>
+              <w:t>59</w:t>
             </w:r>
           </w:p>
         </w:tc>
@@ -822,7 +822,7 @@
           </w:tcPr>
           <w:p>
             <w:r>
-              <w:t>25</w:t>
+              <w:t>26</w:t>
             </w:r>
           </w:p>
         </w:tc>
@@ -832,7 +832,7 @@
           </w:tcPr>
           <w:p>
             <w:r>
-              <w:t>15</w:t>
+              <w:t>16</w:t>
             </w:r>
           </w:p>
         </w:tc>
@@ -842,7 +842,7 @@
           </w:tcPr>
           <w:p>
             <w:r>
-              <w:t>65</w:t>
+              <w:t>66</w:t>
             </w:r>
           </w:p>
         </w:tc>
@@ -862,7 +862,7 @@
           </w:tcPr>
           <w:p>
             <w:r>
-              <w:t>148</w:t>
+              <w:t>145</w:t>
             </w:r>
           </w:p>
         </w:tc>
@@ -904,7 +904,7 @@
           </w:tcPr>
           <w:p>
             <w:r>
-              <w:t>86</w:t>
+              <w:t>87</w:t>
             </w:r>
           </w:p>
         </w:tc>
@@ -924,7 +924,7 @@
           </w:tcPr>
           <w:p>
             <w:r>
-              <w:t>123</w:t>
+              <w:t>122</w:t>
             </w:r>
           </w:p>
         </w:tc>
@@ -995,7 +995,7 @@
     <w:p/>
     <w:p>
       <w:r>
-        <w:t>Of 762 county-elections, 375 were determined: 82 by check 1 (vendor update log), 287 by check 2 (county-posted reports), and 6 by check 3 (Wayback captures). 387 remain UNDETERMINED.</w:t>
+        <w:t>Of 762 county-elections, 379 were determined: 82 by check 1 (vendor update log), 287 by check 2 (county-posted reports), and 10 by check 3 (Wayback captures). 383 remain UNDETERMINED.</w:t>
       </w:r>
     </w:p>
     <w:p>
@@ -5376,7 +5376,7 @@
           </w:tcPr>
           <w:p>
             <w:r>
-              <w:t>UND</w:t>
+              <w:t>END (3)</w:t>
             </w:r>
           </w:p>
         </w:tc>
@@ -9640,7 +9640,7 @@
           </w:tcPr>
           <w:p>
             <w:r>
-              <w:t>UND</w:t>
+              <w:t>LIVE (3)</w:t>
             </w:r>
           </w:p>
         </w:tc>
@@ -10296,7 +10296,7 @@
           </w:tcPr>
           <w:p>
             <w:r>
-              <w:t>UND</w:t>
+              <w:t>LATER (3)</w:t>
             </w:r>
           </w:p>
         </w:tc>
@@ -20208,7 +20208,7 @@
           </w:tcPr>
           <w:p>
             <w:r>
-              <w:t>low</w:t>
+              <w:t>med</w:t>
             </w:r>
           </w:p>
         </w:tc>
@@ -20228,7 +20228,7 @@
           </w:tcPr>
           <w:p>
             <w:r>
-              <w:t>UND</w:t>
+              <w:t>LATER (3)</w:t>
             </w:r>
           </w:p>
         </w:tc>

</xml_diff>